<commit_message>
Visão geral da estrtura
</commit_message>
<xml_diff>
--- a/Estruturação da Aplicação.docx
+++ b/Estruturação da Aplicação.docx
@@ -1,8 +1,8 @@
 
 <file path=word/document.xml><?xml version="1.0" encoding="utf-8"?>
-<w:document xmlns:wpc="http://schemas.microsoft.com/office/word/2010/wordprocessingCanvas" xmlns:mc="http://schemas.openxmlformats.org/markup-compatibility/2006" xmlns:o="urn:schemas-microsoft-com:office:office" xmlns:r="http://schemas.openxmlformats.org/officeDocument/2006/relationships" xmlns:m="http://schemas.openxmlformats.org/officeDocument/2006/math" xmlns:v="urn:schemas-microsoft-com:vml" xmlns:wp14="http://schemas.microsoft.com/office/word/2010/wordprocessingDrawing" xmlns:wp="http://schemas.openxmlformats.org/drawingml/2006/wordprocessingDrawing" xmlns:w10="urn:schemas-microsoft-com:office:word" xmlns:w="http://schemas.openxmlformats.org/wordprocessingml/2006/main" xmlns:w14="http://schemas.microsoft.com/office/word/2010/wordml" xmlns:w15="http://schemas.microsoft.com/office/word/2012/wordml" xmlns:wpg="http://schemas.microsoft.com/office/word/2010/wordprocessingGroup" xmlns:wpi="http://schemas.microsoft.com/office/word/2010/wordprocessingInk" xmlns:wne="http://schemas.microsoft.com/office/word/2006/wordml" xmlns:wps="http://schemas.microsoft.com/office/word/2010/wordprocessingShape" xmlns:w16se="http://schemas.microsoft.com/office/word/2015/wordml/symex" xmlns:w16cid="http://schemas.microsoft.com/office/word/2016/wordml/cid" xmlns:w16="http://schemas.microsoft.com/office/word/2018/wordml" xmlns:w16cex="http://schemas.microsoft.com/office/word/2018/wordml/cex" xmlns:w16sdtdh="http://schemas.microsoft.com/office/word/2020/wordml/sdtdatahash" xmlns:w16sdtfl="http://schemas.microsoft.com/office/word/2024/wordml/sdtformatlock" mc:Ignorable="w14 w15 wp14 w16se w16cid w16 w16cex w16sdtdh w16sdtfl">
+<w:document xmlns:wpc="http://schemas.microsoft.com/office/word/2010/wordprocessingCanvas" xmlns:cx="http://schemas.microsoft.com/office/drawing/2014/chartex" xmlns:cx1="http://schemas.microsoft.com/office/drawing/2015/9/8/chartex" xmlns:cx2="http://schemas.microsoft.com/office/drawing/2015/10/21/chartex" xmlns:cx3="http://schemas.microsoft.com/office/drawing/2016/5/9/chartex" xmlns:cx4="http://schemas.microsoft.com/office/drawing/2016/5/10/chartex" xmlns:cx5="http://schemas.microsoft.com/office/drawing/2016/5/11/chartex" xmlns:cx6="http://schemas.microsoft.com/office/drawing/2016/5/12/chartex" xmlns:cx7="http://schemas.microsoft.com/office/drawing/2016/5/13/chartex" xmlns:cx8="http://schemas.microsoft.com/office/drawing/2016/5/14/chartex" xmlns:mc="http://schemas.openxmlformats.org/markup-compatibility/2006" xmlns:aink="http://schemas.microsoft.com/office/drawing/2016/ink" xmlns:am3d="http://schemas.microsoft.com/office/drawing/2017/model3d" xmlns:o="urn:schemas-microsoft-com:office:office" xmlns:oel="http://schemas.microsoft.com/office/2019/extlst" xmlns:r="http://schemas.openxmlformats.org/officeDocument/2006/relationships" xmlns:m="http://schemas.openxmlformats.org/officeDocument/2006/math" xmlns:v="urn:schemas-microsoft-com:vml" xmlns:wp14="http://schemas.microsoft.com/office/word/2010/wordprocessingDrawing" xmlns:wp="http://schemas.openxmlformats.org/drawingml/2006/wordprocessingDrawing" xmlns:w10="urn:schemas-microsoft-com:office:word" xmlns:w="http://schemas.openxmlformats.org/wordprocessingml/2006/main" xmlns:w14="http://schemas.microsoft.com/office/word/2010/wordml" xmlns:w15="http://schemas.microsoft.com/office/word/2012/wordml" xmlns:w16cex="http://schemas.microsoft.com/office/word/2018/wordml/cex" xmlns:w16cid="http://schemas.microsoft.com/office/word/2016/wordml/cid" xmlns:w16="http://schemas.microsoft.com/office/word/2018/wordml" xmlns:w16du="http://schemas.microsoft.com/office/word/2023/wordml/word16du" xmlns:w16sdtdh="http://schemas.microsoft.com/office/word/2020/wordml/sdtdatahash" xmlns:w16sdtfl="http://schemas.microsoft.com/office/word/2024/wordml/sdtformatlock" xmlns:w16se="http://schemas.microsoft.com/office/word/2015/wordml/symex" xmlns:wpg="http://schemas.microsoft.com/office/word/2010/wordprocessingGroup" xmlns:wpi="http://schemas.microsoft.com/office/word/2010/wordprocessingInk" xmlns:wne="http://schemas.microsoft.com/office/word/2006/wordml" xmlns:wps="http://schemas.microsoft.com/office/word/2010/wordprocessingShape" mc:Ignorable="w14 w15 w16se w16cid w16 w16cex w16sdtdh w16sdtfl w16du wp14">
   <w:body>
-    <w:p xmlns:wp14="http://schemas.microsoft.com/office/word/2010/wordml" wp14:paraId="092EF4B1" wp14:textId="7872ADA5">
+    <w:p>
       <w:pPr>
         <w:jc w:val="center"/>
         <w:rPr>
@@ -29,7 +29,100 @@
     </w:p>
     <w:p>
       <w:pPr>
-        <w:jc w:val="left"/>
+        <w:rPr>
+          <w:sz w:val="36"/>
+          <w:szCs w:val="36"/>
+        </w:rPr>
+      </w:pPr>
+      <w:r>
+        <w:rPr>
+          <w:sz w:val="36"/>
+          <w:szCs w:val="36"/>
+        </w:rPr>
+        <w:t>Visão geral da estrutura:</w:t>
+      </w:r>
+    </w:p>
+    <w:p>
+      <w:r>
+        <w:rPr>
+          <w:sz w:val="36"/>
+          <w:szCs w:val="36"/>
+        </w:rPr>
+        <w:tab/>
+      </w:r>
+      <w:r>
+        <w:t xml:space="preserve">A aplicação Mu </w:t>
+      </w:r>
+      <w:proofErr w:type="spellStart"/>
+      <w:r>
+        <w:t>Torere</w:t>
+      </w:r>
+      <w:proofErr w:type="spellEnd"/>
+      <w:r>
+        <w:t xml:space="preserve"> em rede está organizada em cinco pacotes com responsabilidades claramente separadas, seguindo o princípio da separação de responsabilidades (SRP). A comunicação entre jogadores é feita via TCP/IP com uma </w:t>
+      </w:r>
+      <w:proofErr w:type="spellStart"/>
+      <w:r>
+        <w:t>arquitectura</w:t>
+      </w:r>
+      <w:proofErr w:type="spellEnd"/>
+      <w:r>
+        <w:t xml:space="preserve"> cliente-servidor: uma das máquinas </w:t>
+      </w:r>
+      <w:proofErr w:type="spellStart"/>
+      <w:r>
+        <w:t>actua</w:t>
+      </w:r>
+      <w:proofErr w:type="spellEnd"/>
+      <w:r>
+        <w:t xml:space="preserve"> como servidor e ambas executam o cliente.</w:t>
+      </w:r>
+    </w:p>
+    <w:p/>
+    <w:p>
+      <w:r>
+        <w:rPr>
+          <w:noProof/>
+        </w:rPr>
+        <w:drawing>
+          <wp:inline distT="0" distB="0" distL="0" distR="0" wp14:anchorId="08B70C85" wp14:editId="19C66238">
+            <wp:extent cx="5731510" cy="1948180"/>
+            <wp:effectExtent l="0" t="0" r="2540" b="0"/>
+            <wp:docPr id="1500619409" name="Imagem 1"/>
+            <wp:cNvGraphicFramePr>
+              <a:graphicFrameLocks xmlns:a="http://schemas.openxmlformats.org/drawingml/2006/main" noChangeAspect="1"/>
+            </wp:cNvGraphicFramePr>
+            <a:graphic xmlns:a="http://schemas.openxmlformats.org/drawingml/2006/main">
+              <a:graphicData uri="http://schemas.openxmlformats.org/drawingml/2006/picture">
+                <pic:pic xmlns:pic="http://schemas.openxmlformats.org/drawingml/2006/picture">
+                  <pic:nvPicPr>
+                    <pic:cNvPr id="1500619409" name=""/>
+                    <pic:cNvPicPr/>
+                  </pic:nvPicPr>
+                  <pic:blipFill>
+                    <a:blip r:embed="rId4"/>
+                    <a:stretch>
+                      <a:fillRect/>
+                    </a:stretch>
+                  </pic:blipFill>
+                  <pic:spPr>
+                    <a:xfrm>
+                      <a:off x="0" y="0"/>
+                      <a:ext cx="5731510" cy="1948180"/>
+                    </a:xfrm>
+                    <a:prstGeom prst="rect">
+                      <a:avLst/>
+                    </a:prstGeom>
+                  </pic:spPr>
+                </pic:pic>
+              </a:graphicData>
+            </a:graphic>
+          </wp:inline>
+        </w:drawing>
+      </w:r>
+    </w:p>
+    <w:p>
+      <w:pPr>
         <w:rPr>
           <w:sz w:val="48"/>
           <w:szCs w:val="48"/>
@@ -38,7 +131,6 @@
     </w:p>
     <w:p>
       <w:pPr>
-        <w:jc w:val="left"/>
         <w:rPr>
           <w:sz w:val="48"/>
           <w:szCs w:val="48"/>
@@ -47,7 +139,6 @@
     </w:p>
     <w:p>
       <w:pPr>
-        <w:jc w:val="left"/>
         <w:rPr>
           <w:sz w:val="36"/>
           <w:szCs w:val="36"/>
@@ -55,7 +146,7 @@
       </w:pPr>
     </w:p>
     <w:sectPr>
-      <w:pgSz w:w="11906" w:h="16838" w:orient="portrait"/>
+      <w:pgSz w:w="11906" w:h="16838"/>
       <w:pgMar w:top="1440" w:right="1440" w:bottom="1440" w:left="1440" w:header="720" w:footer="720" w:gutter="0"/>
       <w:cols w:space="720"/>
       <w:docGrid w:linePitch="360"/>
@@ -65,11 +156,11 @@
 </file>
 
 <file path=word/styles.xml><?xml version="1.0" encoding="utf-8"?>
-<w:styles xmlns:wp14="http://schemas.microsoft.com/office/word/2010/wordprocessingDrawing" xmlns:mc="http://schemas.openxmlformats.org/markup-compatibility/2006" xmlns:r="http://schemas.openxmlformats.org/officeDocument/2006/relationships" xmlns:w="http://schemas.openxmlformats.org/wordprocessingml/2006/main" xmlns:w14="http://schemas.microsoft.com/office/word/2010/wordml" xmlns:w15="http://schemas.microsoft.com/office/word/2012/wordml" xmlns:w16se="http://schemas.microsoft.com/office/word/2015/wordml/symex" xmlns:w16cid="http://schemas.microsoft.com/office/word/2016/wordml/cid" xmlns:w16="http://schemas.microsoft.com/office/word/2018/wordml" xmlns:w16cex="http://schemas.microsoft.com/office/word/2018/wordml/cex" xmlns:w16sdtdh="http://schemas.microsoft.com/office/word/2020/wordml/sdtdatahash" xmlns:w16sdtfl="http://schemas.microsoft.com/office/word/2024/wordml/sdtformatlock" mc:Ignorable="w14 w15 wp14 w16se w16cid w16 w16cex w16sdtdh w16sdtfl">
+<w:styles xmlns:mc="http://schemas.openxmlformats.org/markup-compatibility/2006" xmlns:r="http://schemas.openxmlformats.org/officeDocument/2006/relationships" xmlns:w="http://schemas.openxmlformats.org/wordprocessingml/2006/main" xmlns:w14="http://schemas.microsoft.com/office/word/2010/wordml" xmlns:w15="http://schemas.microsoft.com/office/word/2012/wordml" xmlns:w16cex="http://schemas.microsoft.com/office/word/2018/wordml/cex" xmlns:w16cid="http://schemas.microsoft.com/office/word/2016/wordml/cid" xmlns:w16="http://schemas.microsoft.com/office/word/2018/wordml" xmlns:w16du="http://schemas.microsoft.com/office/word/2023/wordml/word16du" xmlns:w16sdtdh="http://schemas.microsoft.com/office/word/2020/wordml/sdtdatahash" xmlns:w16sdtfl="http://schemas.microsoft.com/office/word/2024/wordml/sdtformatlock" xmlns:w16se="http://schemas.microsoft.com/office/word/2015/wordml/symex" mc:Ignorable="w14 w15 w16se w16cid w16 w16cex w16sdtdh w16sdtfl w16du">
   <w:docDefaults>
     <w:rPrDefault>
       <w:rPr>
-        <w:rFonts w:asciiTheme="minorHAnsi" w:hAnsiTheme="minorHAnsi" w:eastAsiaTheme="minorHAnsi" w:cstheme="minorBidi"/>
+        <w:rFonts w:asciiTheme="minorHAnsi" w:eastAsiaTheme="minorHAnsi" w:hAnsiTheme="minorHAnsi" w:cstheme="minorBidi"/>
         <w:sz w:val="24"/>
         <w:szCs w:val="24"/>
         <w:lang w:val="pt-PT" w:eastAsia="en-US" w:bidi="ar-SA"/>
@@ -81,17 +172,17 @@
       </w:pPr>
     </w:pPrDefault>
   </w:docDefaults>
-  <w:latentStyles w:defLockedState="0" w:defUIPriority="99" w:defSemiHidden="0" w:defUnhideWhenUsed="0" w:defQFormat="0" w:count="371">
+  <w:latentStyles w:defLockedState="0" w:defUIPriority="99" w:defSemiHidden="0" w:defUnhideWhenUsed="0" w:defQFormat="0" w:count="376">
     <w:lsdException w:name="Normal" w:uiPriority="0" w:qFormat="1"/>
     <w:lsdException w:name="heading 1" w:uiPriority="9" w:qFormat="1"/>
-    <w:lsdException w:name="heading 2" w:uiPriority="9" w:semiHidden="1" w:unhideWhenUsed="1" w:qFormat="1"/>
-    <w:lsdException w:name="heading 3" w:uiPriority="9" w:semiHidden="1" w:unhideWhenUsed="1" w:qFormat="1"/>
-    <w:lsdException w:name="heading 4" w:uiPriority="9" w:semiHidden="1" w:unhideWhenUsed="1" w:qFormat="1"/>
-    <w:lsdException w:name="heading 5" w:uiPriority="9" w:semiHidden="1" w:unhideWhenUsed="1" w:qFormat="1"/>
-    <w:lsdException w:name="heading 6" w:uiPriority="9" w:semiHidden="1" w:unhideWhenUsed="1" w:qFormat="1"/>
-    <w:lsdException w:name="heading 7" w:uiPriority="9" w:semiHidden="1" w:unhideWhenUsed="1" w:qFormat="1"/>
-    <w:lsdException w:name="heading 8" w:uiPriority="9" w:semiHidden="1" w:unhideWhenUsed="1" w:qFormat="1"/>
-    <w:lsdException w:name="heading 9" w:uiPriority="9" w:semiHidden="1" w:unhideWhenUsed="1" w:qFormat="1"/>
+    <w:lsdException w:name="heading 2" w:semiHidden="1" w:uiPriority="9" w:unhideWhenUsed="1" w:qFormat="1"/>
+    <w:lsdException w:name="heading 3" w:semiHidden="1" w:uiPriority="9" w:unhideWhenUsed="1" w:qFormat="1"/>
+    <w:lsdException w:name="heading 4" w:semiHidden="1" w:uiPriority="9" w:unhideWhenUsed="1" w:qFormat="1"/>
+    <w:lsdException w:name="heading 5" w:semiHidden="1" w:uiPriority="9" w:unhideWhenUsed="1" w:qFormat="1"/>
+    <w:lsdException w:name="heading 6" w:semiHidden="1" w:uiPriority="9" w:unhideWhenUsed="1" w:qFormat="1"/>
+    <w:lsdException w:name="heading 7" w:semiHidden="1" w:uiPriority="9" w:unhideWhenUsed="1" w:qFormat="1"/>
+    <w:lsdException w:name="heading 8" w:semiHidden="1" w:uiPriority="9" w:unhideWhenUsed="1" w:qFormat="1"/>
+    <w:lsdException w:name="heading 9" w:semiHidden="1" w:uiPriority="9" w:unhideWhenUsed="1" w:qFormat="1"/>
     <w:lsdException w:name="index 1" w:semiHidden="1" w:unhideWhenUsed="1"/>
     <w:lsdException w:name="index 2" w:semiHidden="1" w:unhideWhenUsed="1"/>
     <w:lsdException w:name="index 3" w:semiHidden="1" w:unhideWhenUsed="1"/>
@@ -101,22 +192,22 @@
     <w:lsdException w:name="index 7" w:semiHidden="1" w:unhideWhenUsed="1"/>
     <w:lsdException w:name="index 8" w:semiHidden="1" w:unhideWhenUsed="1"/>
     <w:lsdException w:name="index 9" w:semiHidden="1" w:unhideWhenUsed="1"/>
-    <w:lsdException w:name="toc 1" w:uiPriority="39" w:semiHidden="1" w:unhideWhenUsed="1"/>
-    <w:lsdException w:name="toc 2" w:uiPriority="39" w:semiHidden="1" w:unhideWhenUsed="1"/>
-    <w:lsdException w:name="toc 3" w:uiPriority="39" w:semiHidden="1" w:unhideWhenUsed="1"/>
-    <w:lsdException w:name="toc 4" w:uiPriority="39" w:semiHidden="1" w:unhideWhenUsed="1"/>
-    <w:lsdException w:name="toc 5" w:uiPriority="39" w:semiHidden="1" w:unhideWhenUsed="1"/>
-    <w:lsdException w:name="toc 6" w:uiPriority="39" w:semiHidden="1" w:unhideWhenUsed="1"/>
-    <w:lsdException w:name="toc 7" w:uiPriority="39" w:semiHidden="1" w:unhideWhenUsed="1"/>
-    <w:lsdException w:name="toc 8" w:uiPriority="39" w:semiHidden="1" w:unhideWhenUsed="1"/>
-    <w:lsdException w:name="toc 9" w:uiPriority="39" w:semiHidden="1" w:unhideWhenUsed="1"/>
+    <w:lsdException w:name="toc 1" w:semiHidden="1" w:uiPriority="39" w:unhideWhenUsed="1"/>
+    <w:lsdException w:name="toc 2" w:semiHidden="1" w:uiPriority="39" w:unhideWhenUsed="1"/>
+    <w:lsdException w:name="toc 3" w:semiHidden="1" w:uiPriority="39" w:unhideWhenUsed="1"/>
+    <w:lsdException w:name="toc 4" w:semiHidden="1" w:uiPriority="39" w:unhideWhenUsed="1"/>
+    <w:lsdException w:name="toc 5" w:semiHidden="1" w:uiPriority="39" w:unhideWhenUsed="1"/>
+    <w:lsdException w:name="toc 6" w:semiHidden="1" w:uiPriority="39" w:unhideWhenUsed="1"/>
+    <w:lsdException w:name="toc 7" w:semiHidden="1" w:uiPriority="39" w:unhideWhenUsed="1"/>
+    <w:lsdException w:name="toc 8" w:semiHidden="1" w:uiPriority="39" w:unhideWhenUsed="1"/>
+    <w:lsdException w:name="toc 9" w:semiHidden="1" w:uiPriority="39" w:unhideWhenUsed="1"/>
     <w:lsdException w:name="Normal Indent" w:semiHidden="1" w:unhideWhenUsed="1"/>
     <w:lsdException w:name="footnote text" w:semiHidden="1" w:unhideWhenUsed="1"/>
     <w:lsdException w:name="annotation text" w:semiHidden="1" w:unhideWhenUsed="1"/>
     <w:lsdException w:name="header" w:semiHidden="1" w:unhideWhenUsed="1"/>
     <w:lsdException w:name="footer" w:semiHidden="1" w:unhideWhenUsed="1"/>
     <w:lsdException w:name="index heading" w:semiHidden="1" w:unhideWhenUsed="1"/>
-    <w:lsdException w:name="caption" w:uiPriority="35" w:semiHidden="1" w:unhideWhenUsed="1" w:qFormat="1"/>
+    <w:lsdException w:name="caption" w:semiHidden="1" w:uiPriority="35" w:unhideWhenUsed="1" w:qFormat="1"/>
     <w:lsdException w:name="table of figures" w:semiHidden="1" w:unhideWhenUsed="1"/>
     <w:lsdException w:name="envelope address" w:semiHidden="1" w:unhideWhenUsed="1"/>
     <w:lsdException w:name="envelope return" w:semiHidden="1" w:unhideWhenUsed="1"/>
@@ -147,7 +238,7 @@
     <w:lsdException w:name="Title" w:uiPriority="10" w:qFormat="1"/>
     <w:lsdException w:name="Closing" w:semiHidden="1" w:unhideWhenUsed="1"/>
     <w:lsdException w:name="Signature" w:semiHidden="1" w:unhideWhenUsed="1"/>
-    <w:lsdException w:name="Default Paragraph Font" w:uiPriority="1" w:semiHidden="1" w:unhideWhenUsed="1"/>
+    <w:lsdException w:name="Default Paragraph Font" w:semiHidden="1" w:uiPriority="1" w:unhideWhenUsed="1"/>
     <w:lsdException w:name="Body Text" w:semiHidden="1" w:unhideWhenUsed="1"/>
     <w:lsdException w:name="Body Text Indent" w:semiHidden="1" w:unhideWhenUsed="1"/>
     <w:lsdException w:name="List Continue" w:semiHidden="1" w:unhideWhenUsed="1"/>
@@ -347,8 +438,8 @@
     <w:lsdException w:name="Subtle Reference" w:uiPriority="31" w:qFormat="1"/>
     <w:lsdException w:name="Intense Reference" w:uiPriority="32" w:qFormat="1"/>
     <w:lsdException w:name="Book Title" w:uiPriority="33" w:qFormat="1"/>
-    <w:lsdException w:name="Bibliography" w:uiPriority="37" w:semiHidden="1" w:unhideWhenUsed="1"/>
-    <w:lsdException w:name="TOC Heading" w:uiPriority="39" w:semiHidden="1" w:unhideWhenUsed="1" w:qFormat="1"/>
+    <w:lsdException w:name="Bibliography" w:semiHidden="1" w:uiPriority="37" w:unhideWhenUsed="1"/>
+    <w:lsdException w:name="TOC Heading" w:semiHidden="1" w:uiPriority="39" w:unhideWhenUsed="1" w:qFormat="1"/>
     <w:lsdException w:name="Plain Table 1" w:uiPriority="41"/>
     <w:lsdException w:name="Plain Table 2" w:uiPriority="42"/>
     <w:lsdException w:name="Plain Table 3" w:uiPriority="43"/>
@@ -453,18 +544,22 @@
     <w:lsdException w:name="List Table 5 Dark Accent 6" w:uiPriority="50"/>
     <w:lsdException w:name="List Table 6 Colorful Accent 6" w:uiPriority="51"/>
     <w:lsdException w:name="List Table 7 Colorful Accent 6" w:uiPriority="52"/>
+    <w:lsdException w:name="Mention" w:semiHidden="1" w:unhideWhenUsed="1"/>
+    <w:lsdException w:name="Smart Hyperlink" w:semiHidden="1" w:unhideWhenUsed="1"/>
+    <w:lsdException w:name="Hashtag" w:semiHidden="1" w:unhideWhenUsed="1"/>
+    <w:lsdException w:name="Unresolved Mention" w:semiHidden="1" w:unhideWhenUsed="1"/>
+    <w:lsdException w:name="Smart Link" w:semiHidden="1" w:unhideWhenUsed="1"/>
   </w:latentStyles>
-  <w:style w:type="paragraph" w:styleId="Normal" w:default="1">
+  <w:style w:type="paragraph" w:default="1" w:styleId="Normal">
     <w:name w:val="Normal"/>
     <w:qFormat/>
   </w:style>
-  <w:style w:type="character" w:styleId="DefaultParagraphFont" w:default="1">
+  <w:style w:type="character" w:default="1" w:styleId="Tipodeletrapredefinidodopargrafo">
     <w:name w:val="Default Paragraph Font"/>
     <w:uiPriority w:val="1"/>
-    <w:semiHidden/>
     <w:unhideWhenUsed/>
   </w:style>
-  <w:style w:type="table" w:styleId="TableNormal" w:default="1">
+  <w:style w:type="table" w:default="1" w:styleId="Tabelanormal">
     <w:name w:val="Normal Table"/>
     <w:uiPriority w:val="99"/>
     <w:semiHidden/>
@@ -479,7 +574,7 @@
       </w:tblCellMar>
     </w:tblPr>
   </w:style>
-  <w:style w:type="numbering" w:styleId="NoList" w:default="1">
+  <w:style w:type="numbering" w:default="1" w:styleId="Semlista">
     <w:name w:val="No List"/>
     <w:uiPriority w:val="99"/>
     <w:semiHidden/>
@@ -489,7 +584,7 @@
 </file>
 
 <file path=word/theme/theme1.xml><?xml version="1.0" encoding="utf-8"?>
-<a:theme xmlns:thm15="http://schemas.microsoft.com/office/thememl/2012/main" xmlns:a="http://schemas.openxmlformats.org/drawingml/2006/main" name="Office Theme">
+<a:theme xmlns:a="http://schemas.openxmlformats.org/drawingml/2006/main" name="Office Theme">
   <a:themeElements>
     <a:clrScheme name="Office">
       <a:dk1>

</xml_diff>

<commit_message>
Pacote domínio - lógica do jogo
</commit_message>
<xml_diff>
--- a/Estruturação da Aplicação.docx
+++ b/Estruturação da Aplicação.docx
@@ -132,10 +132,602 @@
     <w:p>
       <w:pPr>
         <w:rPr>
-          <w:sz w:val="48"/>
-          <w:szCs w:val="48"/>
-        </w:rPr>
-      </w:pPr>
+          <w:sz w:val="36"/>
+          <w:szCs w:val="36"/>
+        </w:rPr>
+      </w:pPr>
+      <w:r>
+        <w:rPr>
+          <w:sz w:val="36"/>
+          <w:szCs w:val="36"/>
+        </w:rPr>
+        <w:t>Pacote domínio:</w:t>
+      </w:r>
+    </w:p>
+    <w:p>
+      <w:pPr>
+        <w:rPr>
+          <w:sz w:val="36"/>
+          <w:szCs w:val="36"/>
+        </w:rPr>
+      </w:pPr>
+    </w:p>
+    <w:p>
+      <w:r>
+        <w:rPr>
+          <w:sz w:val="36"/>
+          <w:szCs w:val="36"/>
+        </w:rPr>
+        <w:tab/>
+      </w:r>
+      <w:r>
+        <w:t>Contém toda a lógica do jogo, independente de rede ou interface. É o núcleo da aplicação — pode ser testado sem GUI ou rede</w:t>
+      </w:r>
+      <w:r>
+        <w:t>.</w:t>
+      </w:r>
+    </w:p>
+    <w:p/>
+    <w:p/>
+    <w:p/>
+    <w:p/>
+    <w:p/>
+    <w:p/>
+    <w:p>
+      <w:pPr>
+        <w:rPr>
+          <w:sz w:val="32"/>
+          <w:szCs w:val="32"/>
+        </w:rPr>
+      </w:pPr>
+      <w:r>
+        <w:rPr>
+          <w:sz w:val="32"/>
+          <w:szCs w:val="32"/>
+        </w:rPr>
+        <w:lastRenderedPageBreak/>
+        <w:t>Classe JOGO:</w:t>
+      </w:r>
+    </w:p>
+    <w:p>
+      <w:pPr>
+        <w:rPr>
+          <w:sz w:val="32"/>
+          <w:szCs w:val="32"/>
+        </w:rPr>
+      </w:pPr>
+    </w:p>
+    <w:p>
+      <w:pPr>
+        <w:ind w:firstLine="708"/>
+      </w:pPr>
+      <w:r>
+        <w:t xml:space="preserve">Classe central que coordena o fluxo de uma partida. Valida e executa movimentos, verifica a vitória e produz </w:t>
+      </w:r>
+      <w:proofErr w:type="spellStart"/>
+      <w:r>
+        <w:t>snapshots</w:t>
+      </w:r>
+      <w:proofErr w:type="spellEnd"/>
+      <w:r>
+        <w:t xml:space="preserve"> do estado.</w:t>
+      </w:r>
+    </w:p>
+    <w:p>
+      <w:pPr>
+        <w:ind w:firstLine="708"/>
+      </w:pPr>
+    </w:p>
+    <w:p>
+      <w:r>
+        <w:rPr>
+          <w:noProof/>
+        </w:rPr>
+        <w:drawing>
+          <wp:inline distT="0" distB="0" distL="0" distR="0" wp14:anchorId="4D935D6D" wp14:editId="75802D86">
+            <wp:extent cx="5731510" cy="3019425"/>
+            <wp:effectExtent l="0" t="0" r="2540" b="9525"/>
+            <wp:docPr id="717461727" name="Imagem 1"/>
+            <wp:cNvGraphicFramePr>
+              <a:graphicFrameLocks xmlns:a="http://schemas.openxmlformats.org/drawingml/2006/main" noChangeAspect="1"/>
+            </wp:cNvGraphicFramePr>
+            <a:graphic xmlns:a="http://schemas.openxmlformats.org/drawingml/2006/main">
+              <a:graphicData uri="http://schemas.openxmlformats.org/drawingml/2006/picture">
+                <pic:pic xmlns:pic="http://schemas.openxmlformats.org/drawingml/2006/picture">
+                  <pic:nvPicPr>
+                    <pic:cNvPr id="717461727" name=""/>
+                    <pic:cNvPicPr/>
+                  </pic:nvPicPr>
+                  <pic:blipFill>
+                    <a:blip r:embed="rId5"/>
+                    <a:stretch>
+                      <a:fillRect/>
+                    </a:stretch>
+                  </pic:blipFill>
+                  <pic:spPr>
+                    <a:xfrm>
+                      <a:off x="0" y="0"/>
+                      <a:ext cx="5731510" cy="3019425"/>
+                    </a:xfrm>
+                    <a:prstGeom prst="rect">
+                      <a:avLst/>
+                    </a:prstGeom>
+                  </pic:spPr>
+                </pic:pic>
+              </a:graphicData>
+            </a:graphic>
+          </wp:inline>
+        </w:drawing>
+      </w:r>
+    </w:p>
+    <w:p/>
+    <w:p>
+      <w:pPr>
+        <w:rPr>
+          <w:sz w:val="32"/>
+          <w:szCs w:val="32"/>
+        </w:rPr>
+      </w:pPr>
+      <w:r>
+        <w:rPr>
+          <w:sz w:val="32"/>
+          <w:szCs w:val="32"/>
+        </w:rPr>
+        <w:t>Classe TABULEIRO:</w:t>
+      </w:r>
+    </w:p>
+    <w:p>
+      <w:pPr>
+        <w:rPr>
+          <w:sz w:val="32"/>
+          <w:szCs w:val="32"/>
+        </w:rPr>
+      </w:pPr>
+    </w:p>
+    <w:p>
+      <w:r>
+        <w:tab/>
+      </w:r>
+      <w:r>
+        <w:t xml:space="preserve">Define a topologia fixa do tabuleiro — as adjacências entre casas são imutáveis e configuradas no construtor com base nas constantes de </w:t>
+      </w:r>
+      <w:proofErr w:type="spellStart"/>
+      <w:r>
+        <w:t>GameDefinitions</w:t>
+      </w:r>
+      <w:proofErr w:type="spellEnd"/>
+      <w:r>
+        <w:t>.</w:t>
+      </w:r>
+    </w:p>
+    <w:p/>
+    <w:p>
+      <w:r>
+        <w:rPr>
+          <w:noProof/>
+        </w:rPr>
+        <w:drawing>
+          <wp:inline distT="0" distB="0" distL="0" distR="0" wp14:anchorId="3E469A71" wp14:editId="2B53D1CE">
+            <wp:extent cx="5731510" cy="2094865"/>
+            <wp:effectExtent l="0" t="0" r="2540" b="635"/>
+            <wp:docPr id="388912228" name="Imagem 1"/>
+            <wp:cNvGraphicFramePr>
+              <a:graphicFrameLocks xmlns:a="http://schemas.openxmlformats.org/drawingml/2006/main" noChangeAspect="1"/>
+            </wp:cNvGraphicFramePr>
+            <a:graphic xmlns:a="http://schemas.openxmlformats.org/drawingml/2006/main">
+              <a:graphicData uri="http://schemas.openxmlformats.org/drawingml/2006/picture">
+                <pic:pic xmlns:pic="http://schemas.openxmlformats.org/drawingml/2006/picture">
+                  <pic:nvPicPr>
+                    <pic:cNvPr id="388912228" name=""/>
+                    <pic:cNvPicPr/>
+                  </pic:nvPicPr>
+                  <pic:blipFill>
+                    <a:blip r:embed="rId6"/>
+                    <a:stretch>
+                      <a:fillRect/>
+                    </a:stretch>
+                  </pic:blipFill>
+                  <pic:spPr>
+                    <a:xfrm>
+                      <a:off x="0" y="0"/>
+                      <a:ext cx="5731510" cy="2094865"/>
+                    </a:xfrm>
+                    <a:prstGeom prst="rect">
+                      <a:avLst/>
+                    </a:prstGeom>
+                  </pic:spPr>
+                </pic:pic>
+              </a:graphicData>
+            </a:graphic>
+          </wp:inline>
+        </w:drawing>
+      </w:r>
+    </w:p>
+    <w:p>
+      <w:pPr>
+        <w:rPr>
+          <w:sz w:val="32"/>
+          <w:szCs w:val="32"/>
+        </w:rPr>
+      </w:pPr>
+      <w:r>
+        <w:rPr>
+          <w:sz w:val="32"/>
+          <w:szCs w:val="32"/>
+        </w:rPr>
+        <w:lastRenderedPageBreak/>
+        <w:t>Classe CASA:</w:t>
+      </w:r>
+    </w:p>
+    <w:p>
+      <w:pPr>
+        <w:rPr>
+          <w:sz w:val="32"/>
+          <w:szCs w:val="32"/>
+        </w:rPr>
+      </w:pPr>
+    </w:p>
+    <w:p>
+      <w:r>
+        <w:rPr>
+          <w:noProof/>
+        </w:rPr>
+        <w:drawing>
+          <wp:inline distT="0" distB="0" distL="0" distR="0" wp14:anchorId="38E15A58" wp14:editId="3F0166E4">
+            <wp:extent cx="5731510" cy="2343150"/>
+            <wp:effectExtent l="0" t="0" r="2540" b="0"/>
+            <wp:docPr id="1314857413" name="Imagem 1"/>
+            <wp:cNvGraphicFramePr>
+              <a:graphicFrameLocks xmlns:a="http://schemas.openxmlformats.org/drawingml/2006/main" noChangeAspect="1"/>
+            </wp:cNvGraphicFramePr>
+            <a:graphic xmlns:a="http://schemas.openxmlformats.org/drawingml/2006/main">
+              <a:graphicData uri="http://schemas.openxmlformats.org/drawingml/2006/picture">
+                <pic:pic xmlns:pic="http://schemas.openxmlformats.org/drawingml/2006/picture">
+                  <pic:nvPicPr>
+                    <pic:cNvPr id="1314857413" name=""/>
+                    <pic:cNvPicPr/>
+                  </pic:nvPicPr>
+                  <pic:blipFill>
+                    <a:blip r:embed="rId7"/>
+                    <a:stretch>
+                      <a:fillRect/>
+                    </a:stretch>
+                  </pic:blipFill>
+                  <pic:spPr>
+                    <a:xfrm>
+                      <a:off x="0" y="0"/>
+                      <a:ext cx="5731510" cy="2343150"/>
+                    </a:xfrm>
+                    <a:prstGeom prst="rect">
+                      <a:avLst/>
+                    </a:prstGeom>
+                  </pic:spPr>
+                </pic:pic>
+              </a:graphicData>
+            </a:graphic>
+          </wp:inline>
+        </w:drawing>
+      </w:r>
+    </w:p>
+    <w:p/>
+    <w:p>
+      <w:pPr>
+        <w:rPr>
+          <w:sz w:val="32"/>
+          <w:szCs w:val="32"/>
+        </w:rPr>
+      </w:pPr>
+      <w:r>
+        <w:rPr>
+          <w:sz w:val="32"/>
+          <w:szCs w:val="32"/>
+        </w:rPr>
+        <w:t>Classe PEÇA:</w:t>
+      </w:r>
+    </w:p>
+    <w:p>
+      <w:pPr>
+        <w:rPr>
+          <w:sz w:val="32"/>
+          <w:szCs w:val="32"/>
+        </w:rPr>
+      </w:pPr>
+    </w:p>
+    <w:p>
+      <w:pPr>
+        <w:ind w:firstLine="708"/>
+      </w:pPr>
+      <w:r>
+        <w:t xml:space="preserve">Encapsula a lógica de movimento — sabe calcular as suas próprias casas válidas, aplicando as regras do jogo (adjacência e regra do </w:t>
+      </w:r>
+      <w:proofErr w:type="spellStart"/>
+      <w:r>
+        <w:t>putahi</w:t>
+      </w:r>
+      <w:proofErr w:type="spellEnd"/>
+      <w:r>
+        <w:t>).</w:t>
+      </w:r>
+    </w:p>
+    <w:p/>
+    <w:p>
+      <w:r>
+        <w:rPr>
+          <w:noProof/>
+        </w:rPr>
+        <w:drawing>
+          <wp:inline distT="0" distB="0" distL="0" distR="0" wp14:anchorId="22D572E6" wp14:editId="47B3267F">
+            <wp:extent cx="5731510" cy="1766570"/>
+            <wp:effectExtent l="0" t="0" r="2540" b="5080"/>
+            <wp:docPr id="266895724" name="Imagem 1"/>
+            <wp:cNvGraphicFramePr>
+              <a:graphicFrameLocks xmlns:a="http://schemas.openxmlformats.org/drawingml/2006/main" noChangeAspect="1"/>
+            </wp:cNvGraphicFramePr>
+            <a:graphic xmlns:a="http://schemas.openxmlformats.org/drawingml/2006/main">
+              <a:graphicData uri="http://schemas.openxmlformats.org/drawingml/2006/picture">
+                <pic:pic xmlns:pic="http://schemas.openxmlformats.org/drawingml/2006/picture">
+                  <pic:nvPicPr>
+                    <pic:cNvPr id="266895724" name=""/>
+                    <pic:cNvPicPr/>
+                  </pic:nvPicPr>
+                  <pic:blipFill>
+                    <a:blip r:embed="rId8"/>
+                    <a:stretch>
+                      <a:fillRect/>
+                    </a:stretch>
+                  </pic:blipFill>
+                  <pic:spPr>
+                    <a:xfrm>
+                      <a:off x="0" y="0"/>
+                      <a:ext cx="5731510" cy="1766570"/>
+                    </a:xfrm>
+                    <a:prstGeom prst="rect">
+                      <a:avLst/>
+                    </a:prstGeom>
+                  </pic:spPr>
+                </pic:pic>
+              </a:graphicData>
+            </a:graphic>
+          </wp:inline>
+        </w:drawing>
+      </w:r>
+    </w:p>
+    <w:p/>
+    <w:p/>
+    <w:p/>
+    <w:p/>
+    <w:p/>
+    <w:p>
+      <w:pPr>
+        <w:rPr>
+          <w:sz w:val="32"/>
+          <w:szCs w:val="32"/>
+        </w:rPr>
+      </w:pPr>
+      <w:r>
+        <w:rPr>
+          <w:sz w:val="32"/>
+          <w:szCs w:val="32"/>
+        </w:rPr>
+        <w:lastRenderedPageBreak/>
+        <w:t>Classe JOGADOR:</w:t>
+      </w:r>
+    </w:p>
+    <w:p>
+      <w:pPr>
+        <w:rPr>
+          <w:sz w:val="32"/>
+          <w:szCs w:val="32"/>
+        </w:rPr>
+      </w:pPr>
+    </w:p>
+    <w:p>
+      <w:r>
+        <w:rPr>
+          <w:noProof/>
+        </w:rPr>
+        <w:drawing>
+          <wp:inline distT="0" distB="0" distL="0" distR="0" wp14:anchorId="0A18348D" wp14:editId="0C7644CC">
+            <wp:extent cx="5731510" cy="2280285"/>
+            <wp:effectExtent l="0" t="0" r="2540" b="5715"/>
+            <wp:docPr id="614302364" name="Imagem 1"/>
+            <wp:cNvGraphicFramePr>
+              <a:graphicFrameLocks xmlns:a="http://schemas.openxmlformats.org/drawingml/2006/main" noChangeAspect="1"/>
+            </wp:cNvGraphicFramePr>
+            <a:graphic xmlns:a="http://schemas.openxmlformats.org/drawingml/2006/main">
+              <a:graphicData uri="http://schemas.openxmlformats.org/drawingml/2006/picture">
+                <pic:pic xmlns:pic="http://schemas.openxmlformats.org/drawingml/2006/picture">
+                  <pic:nvPicPr>
+                    <pic:cNvPr id="614302364" name=""/>
+                    <pic:cNvPicPr/>
+                  </pic:nvPicPr>
+                  <pic:blipFill>
+                    <a:blip r:embed="rId9"/>
+                    <a:stretch>
+                      <a:fillRect/>
+                    </a:stretch>
+                  </pic:blipFill>
+                  <pic:spPr>
+                    <a:xfrm>
+                      <a:off x="0" y="0"/>
+                      <a:ext cx="5731510" cy="2280285"/>
+                    </a:xfrm>
+                    <a:prstGeom prst="rect">
+                      <a:avLst/>
+                    </a:prstGeom>
+                  </pic:spPr>
+                </pic:pic>
+              </a:graphicData>
+            </a:graphic>
+          </wp:inline>
+        </w:drawing>
+      </w:r>
+    </w:p>
+    <w:p/>
+    <w:p>
+      <w:pPr>
+        <w:rPr>
+          <w:sz w:val="32"/>
+          <w:szCs w:val="32"/>
+        </w:rPr>
+      </w:pPr>
+      <w:r>
+        <w:rPr>
+          <w:sz w:val="32"/>
+          <w:szCs w:val="32"/>
+        </w:rPr>
+        <w:t>Classe ESTADO_DE_JOGO:</w:t>
+      </w:r>
+    </w:p>
+    <w:p>
+      <w:pPr>
+        <w:rPr>
+          <w:sz w:val="32"/>
+          <w:szCs w:val="32"/>
+        </w:rPr>
+      </w:pPr>
+    </w:p>
+    <w:p>
+      <w:r>
+        <w:rPr>
+          <w:noProof/>
+        </w:rPr>
+        <w:drawing>
+          <wp:inline distT="0" distB="0" distL="0" distR="0" wp14:anchorId="307793F2" wp14:editId="702C123B">
+            <wp:extent cx="5731510" cy="1374140"/>
+            <wp:effectExtent l="0" t="0" r="2540" b="0"/>
+            <wp:docPr id="1813617948" name="Imagem 1"/>
+            <wp:cNvGraphicFramePr>
+              <a:graphicFrameLocks xmlns:a="http://schemas.openxmlformats.org/drawingml/2006/main" noChangeAspect="1"/>
+            </wp:cNvGraphicFramePr>
+            <a:graphic xmlns:a="http://schemas.openxmlformats.org/drawingml/2006/main">
+              <a:graphicData uri="http://schemas.openxmlformats.org/drawingml/2006/picture">
+                <pic:pic xmlns:pic="http://schemas.openxmlformats.org/drawingml/2006/picture">
+                  <pic:nvPicPr>
+                    <pic:cNvPr id="1813617948" name=""/>
+                    <pic:cNvPicPr/>
+                  </pic:nvPicPr>
+                  <pic:blipFill>
+                    <a:blip r:embed="rId10"/>
+                    <a:stretch>
+                      <a:fillRect/>
+                    </a:stretch>
+                  </pic:blipFill>
+                  <pic:spPr>
+                    <a:xfrm>
+                      <a:off x="0" y="0"/>
+                      <a:ext cx="5731510" cy="1374140"/>
+                    </a:xfrm>
+                    <a:prstGeom prst="rect">
+                      <a:avLst/>
+                    </a:prstGeom>
+                  </pic:spPr>
+                </pic:pic>
+              </a:graphicData>
+            </a:graphic>
+          </wp:inline>
+        </w:drawing>
+      </w:r>
+    </w:p>
+    <w:p/>
+    <w:p/>
+    <w:p/>
+    <w:p/>
+    <w:p/>
+    <w:p/>
+    <w:p/>
+    <w:p/>
+    <w:p/>
+    <w:p>
+      <w:pPr>
+        <w:rPr>
+          <w:sz w:val="32"/>
+          <w:szCs w:val="32"/>
+        </w:rPr>
+      </w:pPr>
+      <w:r>
+        <w:rPr>
+          <w:sz w:val="32"/>
+          <w:szCs w:val="32"/>
+        </w:rPr>
+        <w:lastRenderedPageBreak/>
+        <w:t>Classe GAMEDEFINITIONS:</w:t>
+      </w:r>
+    </w:p>
+    <w:p>
+      <w:pPr>
+        <w:rPr>
+          <w:sz w:val="32"/>
+          <w:szCs w:val="32"/>
+        </w:rPr>
+      </w:pPr>
+    </w:p>
+    <w:p>
+      <w:r>
+        <w:tab/>
+      </w:r>
+      <w:r>
+        <w:t xml:space="preserve">Classe de constantes e utilitários do domínio — centraliza os valores fixos do jogo para evitar </w:t>
+      </w:r>
+      <w:proofErr w:type="spellStart"/>
+      <w:r>
+        <w:t>magic</w:t>
+      </w:r>
+      <w:proofErr w:type="spellEnd"/>
+      <w:r>
+        <w:t xml:space="preserve"> </w:t>
+      </w:r>
+      <w:proofErr w:type="spellStart"/>
+      <w:r>
+        <w:t>numbers</w:t>
+      </w:r>
+      <w:proofErr w:type="spellEnd"/>
+      <w:r>
+        <w:t xml:space="preserve"> dispersos pelo código.</w:t>
+      </w:r>
+    </w:p>
+    <w:p/>
+    <w:p>
+      <w:r>
+        <w:rPr>
+          <w:noProof/>
+        </w:rPr>
+        <w:drawing>
+          <wp:inline distT="0" distB="0" distL="0" distR="0" wp14:anchorId="21896D1B" wp14:editId="2B74D2EC">
+            <wp:extent cx="5731510" cy="1541145"/>
+            <wp:effectExtent l="0" t="0" r="2540" b="1905"/>
+            <wp:docPr id="1867654504" name="Imagem 1"/>
+            <wp:cNvGraphicFramePr>
+              <a:graphicFrameLocks xmlns:a="http://schemas.openxmlformats.org/drawingml/2006/main" noChangeAspect="1"/>
+            </wp:cNvGraphicFramePr>
+            <a:graphic xmlns:a="http://schemas.openxmlformats.org/drawingml/2006/main">
+              <a:graphicData uri="http://schemas.openxmlformats.org/drawingml/2006/picture">
+                <pic:pic xmlns:pic="http://schemas.openxmlformats.org/drawingml/2006/picture">
+                  <pic:nvPicPr>
+                    <pic:cNvPr id="1867654504" name=""/>
+                    <pic:cNvPicPr/>
+                  </pic:nvPicPr>
+                  <pic:blipFill>
+                    <a:blip r:embed="rId11"/>
+                    <a:stretch>
+                      <a:fillRect/>
+                    </a:stretch>
+                  </pic:blipFill>
+                  <pic:spPr>
+                    <a:xfrm>
+                      <a:off x="0" y="0"/>
+                      <a:ext cx="5731510" cy="1541145"/>
+                    </a:xfrm>
+                    <a:prstGeom prst="rect">
+                      <a:avLst/>
+                    </a:prstGeom>
+                  </pic:spPr>
+                </pic:pic>
+              </a:graphicData>
+            </a:graphic>
+          </wp:inline>
+        </w:drawing>
+      </w:r>
     </w:p>
     <w:p>
       <w:pPr>

</xml_diff>

<commit_message>
Pacote estado - classes que representam o estado serializável da aplicação
</commit_message>
<xml_diff>
--- a/Estruturação da Aplicação.docx
+++ b/Estruturação da Aplicação.docx
@@ -717,6 +717,320 @@
                     <a:xfrm>
                       <a:off x="0" y="0"/>
                       <a:ext cx="5731510" cy="1541145"/>
+                    </a:xfrm>
+                    <a:prstGeom prst="rect">
+                      <a:avLst/>
+                    </a:prstGeom>
+                  </pic:spPr>
+                </pic:pic>
+              </a:graphicData>
+            </a:graphic>
+          </wp:inline>
+        </w:drawing>
+      </w:r>
+    </w:p>
+    <w:p/>
+    <w:p/>
+    <w:p>
+      <w:pPr>
+        <w:rPr>
+          <w:sz w:val="36"/>
+          <w:szCs w:val="36"/>
+        </w:rPr>
+      </w:pPr>
+      <w:r>
+        <w:rPr>
+          <w:sz w:val="36"/>
+          <w:szCs w:val="36"/>
+        </w:rPr>
+        <w:t>Pacote estado:</w:t>
+      </w:r>
+    </w:p>
+    <w:p>
+      <w:pPr>
+        <w:rPr>
+          <w:sz w:val="32"/>
+          <w:szCs w:val="32"/>
+        </w:rPr>
+      </w:pPr>
+    </w:p>
+    <w:p>
+      <w:r>
+        <w:tab/>
+      </w:r>
+      <w:r>
+        <w:t xml:space="preserve">Contém as classes que representam o estado </w:t>
+      </w:r>
+      <w:proofErr w:type="spellStart"/>
+      <w:r>
+        <w:t>serializável</w:t>
+      </w:r>
+      <w:proofErr w:type="spellEnd"/>
+      <w:r>
+        <w:t xml:space="preserve"> da aplicação — usadas tanto para envio pela rede como para persistência em ficheiro.</w:t>
+      </w:r>
+    </w:p>
+    <w:p/>
+    <w:p>
+      <w:pPr>
+        <w:rPr>
+          <w:sz w:val="32"/>
+          <w:szCs w:val="32"/>
+        </w:rPr>
+      </w:pPr>
+      <w:r>
+        <w:rPr>
+          <w:sz w:val="32"/>
+          <w:szCs w:val="32"/>
+        </w:rPr>
+        <w:t>Classe GAMESTATE:</w:t>
+      </w:r>
+    </w:p>
+    <w:p>
+      <w:pPr>
+        <w:rPr>
+          <w:sz w:val="32"/>
+          <w:szCs w:val="32"/>
+        </w:rPr>
+      </w:pPr>
+    </w:p>
+    <w:p>
+      <w:r>
+        <w:tab/>
+      </w:r>
+      <w:proofErr w:type="spellStart"/>
+      <w:r>
+        <w:t>Snapshot</w:t>
+      </w:r>
+      <w:proofErr w:type="spellEnd"/>
+      <w:r>
+        <w:t xml:space="preserve"> completo e imutável da partida num dado momento. Implementa </w:t>
+      </w:r>
+      <w:proofErr w:type="spellStart"/>
+      <w:r>
+        <w:t>Serializable</w:t>
+      </w:r>
+      <w:proofErr w:type="spellEnd"/>
+      <w:r>
+        <w:t xml:space="preserve"> para poder ser enviado via </w:t>
+      </w:r>
+      <w:proofErr w:type="spellStart"/>
+      <w:r>
+        <w:t>ObjectOutputStream</w:t>
+      </w:r>
+      <w:proofErr w:type="spellEnd"/>
+      <w:r>
+        <w:t xml:space="preserve"> e gravado em ficheiro. É o único </w:t>
+      </w:r>
+      <w:proofErr w:type="spellStart"/>
+      <w:r>
+        <w:t>objecto</w:t>
+      </w:r>
+      <w:proofErr w:type="spellEnd"/>
+      <w:r>
+        <w:t xml:space="preserve"> que circula pela rede.</w:t>
+      </w:r>
+    </w:p>
+    <w:p/>
+    <w:p>
+      <w:r>
+        <w:rPr>
+          <w:noProof/>
+        </w:rPr>
+        <w:lastRenderedPageBreak/>
+        <w:drawing>
+          <wp:inline distT="0" distB="0" distL="0" distR="0" wp14:anchorId="6F362EAD" wp14:editId="5D3B66A7">
+            <wp:extent cx="5731510" cy="2529205"/>
+            <wp:effectExtent l="0" t="0" r="2540" b="4445"/>
+            <wp:docPr id="888389591" name="Imagem 1"/>
+            <wp:cNvGraphicFramePr>
+              <a:graphicFrameLocks xmlns:a="http://schemas.openxmlformats.org/drawingml/2006/main" noChangeAspect="1"/>
+            </wp:cNvGraphicFramePr>
+            <a:graphic xmlns:a="http://schemas.openxmlformats.org/drawingml/2006/main">
+              <a:graphicData uri="http://schemas.openxmlformats.org/drawingml/2006/picture">
+                <pic:pic xmlns:pic="http://schemas.openxmlformats.org/drawingml/2006/picture">
+                  <pic:nvPicPr>
+                    <pic:cNvPr id="888389591" name=""/>
+                    <pic:cNvPicPr/>
+                  </pic:nvPicPr>
+                  <pic:blipFill>
+                    <a:blip r:embed="rId12"/>
+                    <a:stretch>
+                      <a:fillRect/>
+                    </a:stretch>
+                  </pic:blipFill>
+                  <pic:spPr>
+                    <a:xfrm>
+                      <a:off x="0" y="0"/>
+                      <a:ext cx="5731510" cy="2529205"/>
+                    </a:xfrm>
+                    <a:prstGeom prst="rect">
+                      <a:avLst/>
+                    </a:prstGeom>
+                  </pic:spPr>
+                </pic:pic>
+              </a:graphicData>
+            </a:graphic>
+          </wp:inline>
+        </w:drawing>
+      </w:r>
+    </w:p>
+    <w:p/>
+    <w:p>
+      <w:pPr>
+        <w:rPr>
+          <w:sz w:val="32"/>
+          <w:szCs w:val="32"/>
+        </w:rPr>
+      </w:pPr>
+      <w:r>
+        <w:rPr>
+          <w:sz w:val="32"/>
+          <w:szCs w:val="32"/>
+        </w:rPr>
+        <w:t>Classe CONFIGURAÇÃO:</w:t>
+      </w:r>
+    </w:p>
+    <w:p>
+      <w:pPr>
+        <w:rPr>
+          <w:sz w:val="32"/>
+          <w:szCs w:val="32"/>
+        </w:rPr>
+      </w:pPr>
+    </w:p>
+    <w:p>
+      <w:r>
+        <w:rPr>
+          <w:sz w:val="32"/>
+          <w:szCs w:val="32"/>
+        </w:rPr>
+        <w:tab/>
+      </w:r>
+      <w:r>
+        <w:t>Agrupa todos os parâmetros configuráveis pelo utilizador. É carregada no arranque e guardada ao fechar a aplicação.</w:t>
+      </w:r>
+    </w:p>
+    <w:p/>
+    <w:p>
+      <w:r>
+        <w:rPr>
+          <w:noProof/>
+        </w:rPr>
+        <w:drawing>
+          <wp:inline distT="0" distB="0" distL="0" distR="0" wp14:anchorId="56430358" wp14:editId="0C010758">
+            <wp:extent cx="5731510" cy="2244090"/>
+            <wp:effectExtent l="0" t="0" r="2540" b="3810"/>
+            <wp:docPr id="73265157" name="Imagem 1"/>
+            <wp:cNvGraphicFramePr>
+              <a:graphicFrameLocks xmlns:a="http://schemas.openxmlformats.org/drawingml/2006/main" noChangeAspect="1"/>
+            </wp:cNvGraphicFramePr>
+            <a:graphic xmlns:a="http://schemas.openxmlformats.org/drawingml/2006/main">
+              <a:graphicData uri="http://schemas.openxmlformats.org/drawingml/2006/picture">
+                <pic:pic xmlns:pic="http://schemas.openxmlformats.org/drawingml/2006/picture">
+                  <pic:nvPicPr>
+                    <pic:cNvPr id="73265157" name=""/>
+                    <pic:cNvPicPr/>
+                  </pic:nvPicPr>
+                  <pic:blipFill>
+                    <a:blip r:embed="rId13"/>
+                    <a:stretch>
+                      <a:fillRect/>
+                    </a:stretch>
+                  </pic:blipFill>
+                  <pic:spPr>
+                    <a:xfrm>
+                      <a:off x="0" y="0"/>
+                      <a:ext cx="5731510" cy="2244090"/>
+                    </a:xfrm>
+                    <a:prstGeom prst="rect">
+                      <a:avLst/>
+                    </a:prstGeom>
+                  </pic:spPr>
+                </pic:pic>
+              </a:graphicData>
+            </a:graphic>
+          </wp:inline>
+        </w:drawing>
+      </w:r>
+    </w:p>
+    <w:p/>
+    <w:p/>
+    <w:p/>
+    <w:p/>
+    <w:p/>
+    <w:p/>
+    <w:p>
+      <w:pPr>
+        <w:rPr>
+          <w:sz w:val="32"/>
+          <w:szCs w:val="32"/>
+        </w:rPr>
+      </w:pPr>
+      <w:r>
+        <w:rPr>
+          <w:sz w:val="32"/>
+          <w:szCs w:val="32"/>
+        </w:rPr>
+        <w:lastRenderedPageBreak/>
+        <w:t>Classe JOGADA:</w:t>
+      </w:r>
+    </w:p>
+    <w:p>
+      <w:pPr>
+        <w:rPr>
+          <w:sz w:val="32"/>
+          <w:szCs w:val="32"/>
+        </w:rPr>
+      </w:pPr>
+    </w:p>
+    <w:p>
+      <w:r>
+        <w:tab/>
+      </w:r>
+      <w:r>
+        <w:t xml:space="preserve">Registo imutável de um único movimento. Compõe o histórico dentro do </w:t>
+      </w:r>
+      <w:proofErr w:type="spellStart"/>
+      <w:r>
+        <w:t>GameState</w:t>
+      </w:r>
+      <w:proofErr w:type="spellEnd"/>
+      <w:r>
+        <w:t>.</w:t>
+      </w:r>
+    </w:p>
+    <w:p/>
+    <w:p>
+      <w:r>
+        <w:rPr>
+          <w:noProof/>
+        </w:rPr>
+        <w:drawing>
+          <wp:inline distT="0" distB="0" distL="0" distR="0" wp14:anchorId="2127895E" wp14:editId="2355D253">
+            <wp:extent cx="5731510" cy="1765935"/>
+            <wp:effectExtent l="0" t="0" r="2540" b="5715"/>
+            <wp:docPr id="1880480078" name="Imagem 1"/>
+            <wp:cNvGraphicFramePr>
+              <a:graphicFrameLocks xmlns:a="http://schemas.openxmlformats.org/drawingml/2006/main" noChangeAspect="1"/>
+            </wp:cNvGraphicFramePr>
+            <a:graphic xmlns:a="http://schemas.openxmlformats.org/drawingml/2006/main">
+              <a:graphicData uri="http://schemas.openxmlformats.org/drawingml/2006/picture">
+                <pic:pic xmlns:pic="http://schemas.openxmlformats.org/drawingml/2006/picture">
+                  <pic:nvPicPr>
+                    <pic:cNvPr id="1880480078" name=""/>
+                    <pic:cNvPicPr/>
+                  </pic:nvPicPr>
+                  <pic:blipFill>
+                    <a:blip r:embed="rId14"/>
+                    <a:stretch>
+                      <a:fillRect/>
+                    </a:stretch>
+                  </pic:blipFill>
+                  <pic:spPr>
+                    <a:xfrm>
+                      <a:off x="0" y="0"/>
+                      <a:ext cx="5731510" cy="1765935"/>
                     </a:xfrm>
                     <a:prstGeom prst="rect">
                       <a:avLst/>

</xml_diff>

<commit_message>
Pacote rede - Implementa a comunicação TCP entre as duas instâncias da aplicação
</commit_message>
<xml_diff>
--- a/Estruturação da Aplicação.docx
+++ b/Estruturação da Aplicação.docx
@@ -1031,6 +1031,694 @@
                     <a:xfrm>
                       <a:off x="0" y="0"/>
                       <a:ext cx="5731510" cy="1765935"/>
+                    </a:xfrm>
+                    <a:prstGeom prst="rect">
+                      <a:avLst/>
+                    </a:prstGeom>
+                  </pic:spPr>
+                </pic:pic>
+              </a:graphicData>
+            </a:graphic>
+          </wp:inline>
+        </w:drawing>
+      </w:r>
+    </w:p>
+    <w:p/>
+    <w:p/>
+    <w:p>
+      <w:pPr>
+        <w:rPr>
+          <w:sz w:val="36"/>
+          <w:szCs w:val="36"/>
+        </w:rPr>
+      </w:pPr>
+      <w:r>
+        <w:rPr>
+          <w:sz w:val="36"/>
+          <w:szCs w:val="36"/>
+        </w:rPr>
+        <w:t xml:space="preserve">Pacote </w:t>
+      </w:r>
+      <w:r>
+        <w:rPr>
+          <w:sz w:val="36"/>
+          <w:szCs w:val="36"/>
+        </w:rPr>
+        <w:t>rede:</w:t>
+      </w:r>
+    </w:p>
+    <w:p>
+      <w:pPr>
+        <w:rPr>
+          <w:sz w:val="36"/>
+          <w:szCs w:val="36"/>
+        </w:rPr>
+      </w:pPr>
+    </w:p>
+    <w:p>
+      <w:r>
+        <w:tab/>
+      </w:r>
+      <w:r>
+        <w:t xml:space="preserve">Implementa a comunicação TCP entre as duas instâncias da aplicação. A </w:t>
+      </w:r>
+      <w:proofErr w:type="spellStart"/>
+      <w:r>
+        <w:t>arquitectura</w:t>
+      </w:r>
+      <w:proofErr w:type="spellEnd"/>
+      <w:r>
+        <w:t xml:space="preserve"> é cliente-servidor: uma máquina inicia o </w:t>
+      </w:r>
+      <w:proofErr w:type="spellStart"/>
+      <w:r>
+        <w:t>GameServer</w:t>
+      </w:r>
+      <w:proofErr w:type="spellEnd"/>
+      <w:r>
+        <w:t xml:space="preserve"> e ambas executam um </w:t>
+      </w:r>
+      <w:proofErr w:type="spellStart"/>
+      <w:r>
+        <w:t>GameClient</w:t>
+      </w:r>
+      <w:proofErr w:type="spellEnd"/>
+      <w:r>
+        <w:t xml:space="preserve">. As mensagens trafegam como </w:t>
+      </w:r>
+      <w:proofErr w:type="spellStart"/>
+      <w:r>
+        <w:t>objectos</w:t>
+      </w:r>
+      <w:proofErr w:type="spellEnd"/>
+      <w:r>
+        <w:t xml:space="preserve"> </w:t>
+      </w:r>
+      <w:proofErr w:type="spellStart"/>
+      <w:r>
+        <w:t>NetworkMessage</w:t>
+      </w:r>
+      <w:proofErr w:type="spellEnd"/>
+      <w:r>
+        <w:t xml:space="preserve"> via </w:t>
+      </w:r>
+      <w:proofErr w:type="spellStart"/>
+      <w:r>
+        <w:t>ObjectOutputStream</w:t>
+      </w:r>
+      <w:proofErr w:type="spellEnd"/>
+      <w:r>
+        <w:t>.</w:t>
+      </w:r>
+    </w:p>
+    <w:p/>
+    <w:p>
+      <w:pPr>
+        <w:rPr>
+          <w:sz w:val="32"/>
+          <w:szCs w:val="32"/>
+        </w:rPr>
+      </w:pPr>
+      <w:r>
+        <w:rPr>
+          <w:sz w:val="32"/>
+          <w:szCs w:val="32"/>
+        </w:rPr>
+        <w:t>Classe G</w:t>
+      </w:r>
+      <w:r>
+        <w:rPr>
+          <w:sz w:val="32"/>
+          <w:szCs w:val="32"/>
+        </w:rPr>
+        <w:t>AME</w:t>
+      </w:r>
+      <w:r>
+        <w:rPr>
+          <w:sz w:val="32"/>
+          <w:szCs w:val="32"/>
+        </w:rPr>
+        <w:t>SERVER:</w:t>
+      </w:r>
+    </w:p>
+    <w:p>
+      <w:pPr>
+        <w:rPr>
+          <w:sz w:val="32"/>
+          <w:szCs w:val="32"/>
+        </w:rPr>
+      </w:pPr>
+    </w:p>
+    <w:p>
+      <w:r>
+        <w:tab/>
+      </w:r>
+      <w:r>
+        <w:t>Corre numa das máquinas (Jogador 1 ou servidor dedicado). Aceita ligações, recebe jogadas de um cliente e difunde o novo estado a todos.</w:t>
+      </w:r>
+    </w:p>
+    <w:p/>
+    <w:p>
+      <w:r>
+        <w:rPr>
+          <w:noProof/>
+        </w:rPr>
+        <w:lastRenderedPageBreak/>
+        <w:drawing>
+          <wp:inline distT="0" distB="0" distL="0" distR="0" wp14:anchorId="6A134E59" wp14:editId="1E7478C5">
+            <wp:extent cx="5731510" cy="2493645"/>
+            <wp:effectExtent l="0" t="0" r="2540" b="1905"/>
+            <wp:docPr id="1229663602" name="Imagem 1"/>
+            <wp:cNvGraphicFramePr>
+              <a:graphicFrameLocks xmlns:a="http://schemas.openxmlformats.org/drawingml/2006/main" noChangeAspect="1"/>
+            </wp:cNvGraphicFramePr>
+            <a:graphic xmlns:a="http://schemas.openxmlformats.org/drawingml/2006/main">
+              <a:graphicData uri="http://schemas.openxmlformats.org/drawingml/2006/picture">
+                <pic:pic xmlns:pic="http://schemas.openxmlformats.org/drawingml/2006/picture">
+                  <pic:nvPicPr>
+                    <pic:cNvPr id="1229663602" name=""/>
+                    <pic:cNvPicPr/>
+                  </pic:nvPicPr>
+                  <pic:blipFill>
+                    <a:blip r:embed="rId15"/>
+                    <a:stretch>
+                      <a:fillRect/>
+                    </a:stretch>
+                  </pic:blipFill>
+                  <pic:spPr>
+                    <a:xfrm>
+                      <a:off x="0" y="0"/>
+                      <a:ext cx="5731510" cy="2493645"/>
+                    </a:xfrm>
+                    <a:prstGeom prst="rect">
+                      <a:avLst/>
+                    </a:prstGeom>
+                  </pic:spPr>
+                </pic:pic>
+              </a:graphicData>
+            </a:graphic>
+          </wp:inline>
+        </w:drawing>
+      </w:r>
+    </w:p>
+    <w:p/>
+    <w:p>
+      <w:pPr>
+        <w:rPr>
+          <w:sz w:val="32"/>
+          <w:szCs w:val="32"/>
+        </w:rPr>
+      </w:pPr>
+      <w:r>
+        <w:rPr>
+          <w:sz w:val="32"/>
+          <w:szCs w:val="32"/>
+        </w:rPr>
+        <w:t>Classe GAMECLIENT:</w:t>
+      </w:r>
+    </w:p>
+    <w:p>
+      <w:pPr>
+        <w:rPr>
+          <w:sz w:val="32"/>
+          <w:szCs w:val="32"/>
+        </w:rPr>
+      </w:pPr>
+    </w:p>
+    <w:p>
+      <w:r>
+        <w:rPr>
+          <w:sz w:val="32"/>
+          <w:szCs w:val="32"/>
+        </w:rPr>
+        <w:tab/>
+      </w:r>
+      <w:r>
+        <w:t xml:space="preserve">Instanciado em cada máquina. Liga-se ao servidor, envia jogadas e recebe </w:t>
+      </w:r>
+      <w:proofErr w:type="spellStart"/>
+      <w:r>
+        <w:t>actualizações</w:t>
+      </w:r>
+      <w:proofErr w:type="spellEnd"/>
+      <w:r>
+        <w:t xml:space="preserve"> de estado que notifica à GUI via </w:t>
+      </w:r>
+      <w:proofErr w:type="spellStart"/>
+      <w:r>
+        <w:t>NetworkListener</w:t>
+      </w:r>
+      <w:proofErr w:type="spellEnd"/>
+      <w:r>
+        <w:t>.</w:t>
+      </w:r>
+    </w:p>
+    <w:p/>
+    <w:p>
+      <w:r>
+        <w:rPr>
+          <w:noProof/>
+        </w:rPr>
+        <w:drawing>
+          <wp:inline distT="0" distB="0" distL="0" distR="0" wp14:anchorId="7D10BA6C" wp14:editId="5ED0C121">
+            <wp:extent cx="5731510" cy="2483485"/>
+            <wp:effectExtent l="0" t="0" r="2540" b="0"/>
+            <wp:docPr id="943043274" name="Imagem 1"/>
+            <wp:cNvGraphicFramePr>
+              <a:graphicFrameLocks xmlns:a="http://schemas.openxmlformats.org/drawingml/2006/main" noChangeAspect="1"/>
+            </wp:cNvGraphicFramePr>
+            <a:graphic xmlns:a="http://schemas.openxmlformats.org/drawingml/2006/main">
+              <a:graphicData uri="http://schemas.openxmlformats.org/drawingml/2006/picture">
+                <pic:pic xmlns:pic="http://schemas.openxmlformats.org/drawingml/2006/picture">
+                  <pic:nvPicPr>
+                    <pic:cNvPr id="943043274" name=""/>
+                    <pic:cNvPicPr/>
+                  </pic:nvPicPr>
+                  <pic:blipFill>
+                    <a:blip r:embed="rId16"/>
+                    <a:stretch>
+                      <a:fillRect/>
+                    </a:stretch>
+                  </pic:blipFill>
+                  <pic:spPr>
+                    <a:xfrm>
+                      <a:off x="0" y="0"/>
+                      <a:ext cx="5731510" cy="2483485"/>
+                    </a:xfrm>
+                    <a:prstGeom prst="rect">
+                      <a:avLst/>
+                    </a:prstGeom>
+                  </pic:spPr>
+                </pic:pic>
+              </a:graphicData>
+            </a:graphic>
+          </wp:inline>
+        </w:drawing>
+      </w:r>
+    </w:p>
+    <w:p/>
+    <w:p/>
+    <w:p/>
+    <w:p/>
+    <w:p/>
+    <w:p>
+      <w:pPr>
+        <w:rPr>
+          <w:sz w:val="32"/>
+          <w:szCs w:val="32"/>
+        </w:rPr>
+      </w:pPr>
+      <w:r>
+        <w:rPr>
+          <w:sz w:val="32"/>
+          <w:szCs w:val="32"/>
+        </w:rPr>
+        <w:lastRenderedPageBreak/>
+        <w:t xml:space="preserve">Classe </w:t>
+      </w:r>
+      <w:r>
+        <w:rPr>
+          <w:sz w:val="32"/>
+          <w:szCs w:val="32"/>
+        </w:rPr>
+        <w:t>NETWORKMESSAGE:</w:t>
+      </w:r>
+    </w:p>
+    <w:p/>
+    <w:p>
+      <w:r>
+        <w:tab/>
+      </w:r>
+      <w:r>
+        <w:t xml:space="preserve">Envelope que encapsula qualquer mensagem trocada pela rede. Implementa </w:t>
+      </w:r>
+      <w:proofErr w:type="spellStart"/>
+      <w:r>
+        <w:t>Serializable</w:t>
+      </w:r>
+      <w:proofErr w:type="spellEnd"/>
+      <w:r>
+        <w:t xml:space="preserve">. O campo </w:t>
+      </w:r>
+      <w:proofErr w:type="spellStart"/>
+      <w:r>
+        <w:t>payload</w:t>
+      </w:r>
+      <w:proofErr w:type="spellEnd"/>
+      <w:r>
+        <w:t xml:space="preserve"> transporta o </w:t>
+      </w:r>
+      <w:proofErr w:type="spellStart"/>
+      <w:r>
+        <w:t>objecto</w:t>
+      </w:r>
+      <w:proofErr w:type="spellEnd"/>
+      <w:r>
+        <w:t xml:space="preserve"> concreto (Jogada, </w:t>
+      </w:r>
+      <w:proofErr w:type="spellStart"/>
+      <w:r>
+        <w:t>GameState</w:t>
+      </w:r>
+      <w:proofErr w:type="spellEnd"/>
+      <w:r>
+        <w:t>, etc.).</w:t>
+      </w:r>
+    </w:p>
+    <w:p/>
+    <w:p>
+      <w:r>
+        <w:rPr>
+          <w:noProof/>
+        </w:rPr>
+        <w:drawing>
+          <wp:inline distT="0" distB="0" distL="0" distR="0" wp14:anchorId="0C20A894" wp14:editId="69C78D6B">
+            <wp:extent cx="5731510" cy="1934210"/>
+            <wp:effectExtent l="0" t="0" r="2540" b="8890"/>
+            <wp:docPr id="553772112" name="Imagem 1"/>
+            <wp:cNvGraphicFramePr>
+              <a:graphicFrameLocks xmlns:a="http://schemas.openxmlformats.org/drawingml/2006/main" noChangeAspect="1"/>
+            </wp:cNvGraphicFramePr>
+            <a:graphic xmlns:a="http://schemas.openxmlformats.org/drawingml/2006/main">
+              <a:graphicData uri="http://schemas.openxmlformats.org/drawingml/2006/picture">
+                <pic:pic xmlns:pic="http://schemas.openxmlformats.org/drawingml/2006/picture">
+                  <pic:nvPicPr>
+                    <pic:cNvPr id="553772112" name=""/>
+                    <pic:cNvPicPr/>
+                  </pic:nvPicPr>
+                  <pic:blipFill>
+                    <a:blip r:embed="rId17"/>
+                    <a:stretch>
+                      <a:fillRect/>
+                    </a:stretch>
+                  </pic:blipFill>
+                  <pic:spPr>
+                    <a:xfrm>
+                      <a:off x="0" y="0"/>
+                      <a:ext cx="5731510" cy="1934210"/>
+                    </a:xfrm>
+                    <a:prstGeom prst="rect">
+                      <a:avLst/>
+                    </a:prstGeom>
+                  </pic:spPr>
+                </pic:pic>
+              </a:graphicData>
+            </a:graphic>
+          </wp:inline>
+        </w:drawing>
+      </w:r>
+    </w:p>
+    <w:p/>
+    <w:p>
+      <w:pPr>
+        <w:rPr>
+          <w:sz w:val="32"/>
+          <w:szCs w:val="32"/>
+        </w:rPr>
+      </w:pPr>
+      <w:proofErr w:type="spellStart"/>
+      <w:r>
+        <w:rPr>
+          <w:sz w:val="32"/>
+          <w:szCs w:val="32"/>
+        </w:rPr>
+        <w:t>Enum</w:t>
+      </w:r>
+      <w:proofErr w:type="spellEnd"/>
+      <w:r>
+        <w:rPr>
+          <w:sz w:val="32"/>
+          <w:szCs w:val="32"/>
+        </w:rPr>
+        <w:t xml:space="preserve"> TIPOMENSAGEM:</w:t>
+      </w:r>
+    </w:p>
+    <w:p>
+      <w:pPr>
+        <w:rPr>
+          <w:sz w:val="32"/>
+          <w:szCs w:val="32"/>
+        </w:rPr>
+      </w:pPr>
+    </w:p>
+    <w:p>
+      <w:pPr>
+        <w:rPr>
+          <w:sz w:val="32"/>
+          <w:szCs w:val="32"/>
+        </w:rPr>
+      </w:pPr>
+      <w:r>
+        <w:rPr>
+          <w:noProof/>
+        </w:rPr>
+        <w:drawing>
+          <wp:inline distT="0" distB="0" distL="0" distR="0" wp14:anchorId="64997E11" wp14:editId="7170364E">
+            <wp:extent cx="5731510" cy="1778000"/>
+            <wp:effectExtent l="0" t="0" r="2540" b="0"/>
+            <wp:docPr id="1061348034" name="Imagem 1"/>
+            <wp:cNvGraphicFramePr>
+              <a:graphicFrameLocks xmlns:a="http://schemas.openxmlformats.org/drawingml/2006/main" noChangeAspect="1"/>
+            </wp:cNvGraphicFramePr>
+            <a:graphic xmlns:a="http://schemas.openxmlformats.org/drawingml/2006/main">
+              <a:graphicData uri="http://schemas.openxmlformats.org/drawingml/2006/picture">
+                <pic:pic xmlns:pic="http://schemas.openxmlformats.org/drawingml/2006/picture">
+                  <pic:nvPicPr>
+                    <pic:cNvPr id="1061348034" name=""/>
+                    <pic:cNvPicPr/>
+                  </pic:nvPicPr>
+                  <pic:blipFill>
+                    <a:blip r:embed="rId18"/>
+                    <a:stretch>
+                      <a:fillRect/>
+                    </a:stretch>
+                  </pic:blipFill>
+                  <pic:spPr>
+                    <a:xfrm>
+                      <a:off x="0" y="0"/>
+                      <a:ext cx="5731510" cy="1778000"/>
+                    </a:xfrm>
+                    <a:prstGeom prst="rect">
+                      <a:avLst/>
+                    </a:prstGeom>
+                  </pic:spPr>
+                </pic:pic>
+              </a:graphicData>
+            </a:graphic>
+          </wp:inline>
+        </w:drawing>
+      </w:r>
+    </w:p>
+    <w:p>
+      <w:pPr>
+        <w:rPr>
+          <w:sz w:val="32"/>
+          <w:szCs w:val="32"/>
+        </w:rPr>
+      </w:pPr>
+    </w:p>
+    <w:p>
+      <w:pPr>
+        <w:rPr>
+          <w:sz w:val="32"/>
+          <w:szCs w:val="32"/>
+        </w:rPr>
+      </w:pPr>
+    </w:p>
+    <w:p>
+      <w:pPr>
+        <w:rPr>
+          <w:sz w:val="32"/>
+          <w:szCs w:val="32"/>
+        </w:rPr>
+      </w:pPr>
+    </w:p>
+    <w:p>
+      <w:pPr>
+        <w:rPr>
+          <w:sz w:val="32"/>
+          <w:szCs w:val="32"/>
+        </w:rPr>
+      </w:pPr>
+    </w:p>
+    <w:p>
+      <w:pPr>
+        <w:rPr>
+          <w:sz w:val="32"/>
+          <w:szCs w:val="32"/>
+        </w:rPr>
+      </w:pPr>
+    </w:p>
+    <w:p>
+      <w:pPr>
+        <w:rPr>
+          <w:sz w:val="32"/>
+          <w:szCs w:val="32"/>
+        </w:rPr>
+      </w:pPr>
+      <w:r>
+        <w:rPr>
+          <w:sz w:val="32"/>
+          <w:szCs w:val="32"/>
+        </w:rPr>
+        <w:lastRenderedPageBreak/>
+        <w:t>Interface NETWORKLISTENER:</w:t>
+      </w:r>
+    </w:p>
+    <w:p>
+      <w:pPr>
+        <w:rPr>
+          <w:sz w:val="32"/>
+          <w:szCs w:val="32"/>
+        </w:rPr>
+      </w:pPr>
+    </w:p>
+    <w:p>
+      <w:r>
+        <w:rPr>
+          <w:sz w:val="32"/>
+          <w:szCs w:val="32"/>
+        </w:rPr>
+        <w:tab/>
+      </w:r>
+      <w:r>
+        <w:t xml:space="preserve">Contrato que o </w:t>
+      </w:r>
+      <w:proofErr w:type="spellStart"/>
+      <w:r>
+        <w:t>GameController</w:t>
+      </w:r>
+      <w:proofErr w:type="spellEnd"/>
+      <w:r>
+        <w:t xml:space="preserve"> (GUI) implementa para receber notificações assíncronas do </w:t>
+      </w:r>
+      <w:proofErr w:type="spellStart"/>
+      <w:r>
+        <w:t>GameClient</w:t>
+      </w:r>
+      <w:proofErr w:type="spellEnd"/>
+      <w:r>
+        <w:t>.</w:t>
+      </w:r>
+    </w:p>
+    <w:p/>
+    <w:p>
+      <w:r>
+        <w:rPr>
+          <w:noProof/>
+        </w:rPr>
+        <w:drawing>
+          <wp:inline distT="0" distB="0" distL="0" distR="0" wp14:anchorId="18DA08C0" wp14:editId="22A11B09">
+            <wp:extent cx="5731510" cy="1296670"/>
+            <wp:effectExtent l="0" t="0" r="2540" b="0"/>
+            <wp:docPr id="2020408756" name="Imagem 1"/>
+            <wp:cNvGraphicFramePr>
+              <a:graphicFrameLocks xmlns:a="http://schemas.openxmlformats.org/drawingml/2006/main" noChangeAspect="1"/>
+            </wp:cNvGraphicFramePr>
+            <a:graphic xmlns:a="http://schemas.openxmlformats.org/drawingml/2006/main">
+              <a:graphicData uri="http://schemas.openxmlformats.org/drawingml/2006/picture">
+                <pic:pic xmlns:pic="http://schemas.openxmlformats.org/drawingml/2006/picture">
+                  <pic:nvPicPr>
+                    <pic:cNvPr id="2020408756" name=""/>
+                    <pic:cNvPicPr/>
+                  </pic:nvPicPr>
+                  <pic:blipFill>
+                    <a:blip r:embed="rId19"/>
+                    <a:stretch>
+                      <a:fillRect/>
+                    </a:stretch>
+                  </pic:blipFill>
+                  <pic:spPr>
+                    <a:xfrm>
+                      <a:off x="0" y="0"/>
+                      <a:ext cx="5731510" cy="1296670"/>
+                    </a:xfrm>
+                    <a:prstGeom prst="rect">
+                      <a:avLst/>
+                    </a:prstGeom>
+                  </pic:spPr>
+                </pic:pic>
+              </a:graphicData>
+            </a:graphic>
+          </wp:inline>
+        </w:drawing>
+      </w:r>
+    </w:p>
+    <w:p/>
+    <w:p>
+      <w:pPr>
+        <w:rPr>
+          <w:sz w:val="32"/>
+          <w:szCs w:val="32"/>
+        </w:rPr>
+      </w:pPr>
+      <w:r>
+        <w:rPr>
+          <w:sz w:val="32"/>
+          <w:szCs w:val="32"/>
+        </w:rPr>
+        <w:t>Classe CONECTIONMANAGER:</w:t>
+      </w:r>
+    </w:p>
+    <w:p>
+      <w:pPr>
+        <w:rPr>
+          <w:sz w:val="32"/>
+          <w:szCs w:val="32"/>
+        </w:rPr>
+      </w:pPr>
+    </w:p>
+    <w:p>
+      <w:r>
+        <w:rPr>
+          <w:sz w:val="32"/>
+          <w:szCs w:val="32"/>
+        </w:rPr>
+        <w:tab/>
+      </w:r>
+      <w:r>
+        <w:t xml:space="preserve">Gere o ciclo de vida da ligação TCP — tentativas de ligação inicial, reconexões automáticas em caso de falha e </w:t>
+      </w:r>
+      <w:proofErr w:type="spellStart"/>
+      <w:r>
+        <w:t>timeouts</w:t>
+      </w:r>
+      <w:proofErr w:type="spellEnd"/>
+      <w:r>
+        <w:t>.</w:t>
+      </w:r>
+    </w:p>
+    <w:p/>
+    <w:p>
+      <w:r>
+        <w:rPr>
+          <w:noProof/>
+        </w:rPr>
+        <w:drawing>
+          <wp:inline distT="0" distB="0" distL="0" distR="0" wp14:anchorId="23118B90" wp14:editId="04F13AAB">
+            <wp:extent cx="5731510" cy="1703070"/>
+            <wp:effectExtent l="0" t="0" r="2540" b="0"/>
+            <wp:docPr id="1328484958" name="Imagem 1"/>
+            <wp:cNvGraphicFramePr>
+              <a:graphicFrameLocks xmlns:a="http://schemas.openxmlformats.org/drawingml/2006/main" noChangeAspect="1"/>
+            </wp:cNvGraphicFramePr>
+            <a:graphic xmlns:a="http://schemas.openxmlformats.org/drawingml/2006/main">
+              <a:graphicData uri="http://schemas.openxmlformats.org/drawingml/2006/picture">
+                <pic:pic xmlns:pic="http://schemas.openxmlformats.org/drawingml/2006/picture">
+                  <pic:nvPicPr>
+                    <pic:cNvPr id="1328484958" name=""/>
+                    <pic:cNvPicPr/>
+                  </pic:nvPicPr>
+                  <pic:blipFill>
+                    <a:blip r:embed="rId20"/>
+                    <a:stretch>
+                      <a:fillRect/>
+                    </a:stretch>
+                  </pic:blipFill>
+                  <pic:spPr>
+                    <a:xfrm>
+                      <a:off x="0" y="0"/>
+                      <a:ext cx="5731510" cy="1703070"/>
                     </a:xfrm>
                     <a:prstGeom prst="rect">
                       <a:avLst/>

</xml_diff>

<commit_message>
Correção do Enum Estado_de_jogo
</commit_message>
<xml_diff>
--- a/Estruturação da Aplicação.docx
+++ b/Estruturação da Aplicação.docx
@@ -576,7 +576,14 @@
           <w:sz w:val="32"/>
           <w:szCs w:val="32"/>
         </w:rPr>
-        <w:t>Classe ESTADO_DE_JOGO:</w:t>
+        <w:t>Enum</w:t>
+      </w:r>
+      <w:r>
+        <w:rPr>
+          <w:sz w:val="32"/>
+          <w:szCs w:val="32"/>
+        </w:rPr>
+        <w:t xml:space="preserve"> ESTADO_DE_JOGO:</w:t>
       </w:r>
     </w:p>
     <w:p>

</xml_diff>

<commit_message>
Pacote persistência - responsável por gravar e carregar o estado completo da aplicação
</commit_message>
<xml_diff>
--- a/Estruturação da Aplicação.docx
+++ b/Estruturação da Aplicação.docx
@@ -1355,8 +1355,6 @@
     <w:p>
       <w:r>
         <w:tab/>
-      </w:r>
-      <w:r>
         <w:t xml:space="preserve">Envelope que encapsula qualquer mensagem trocada pela rede. Implementa </w:t>
       </w:r>
       <w:proofErr w:type="spellStart"/>
@@ -1738,6 +1736,230 @@
         </w:drawing>
       </w:r>
     </w:p>
+    <w:p/>
+    <w:p/>
+    <w:p/>
+    <w:p/>
+    <w:p/>
+    <w:p/>
+    <w:p>
+      <w:pPr>
+        <w:rPr>
+          <w:sz w:val="36"/>
+          <w:szCs w:val="36"/>
+        </w:rPr>
+      </w:pPr>
+      <w:r>
+        <w:rPr>
+          <w:sz w:val="36"/>
+          <w:szCs w:val="36"/>
+        </w:rPr>
+        <w:lastRenderedPageBreak/>
+        <w:t>Pacote persistência:</w:t>
+      </w:r>
+    </w:p>
+    <w:p>
+      <w:pPr>
+        <w:rPr>
+          <w:sz w:val="36"/>
+          <w:szCs w:val="36"/>
+        </w:rPr>
+      </w:pPr>
+    </w:p>
+    <w:p>
+      <w:r>
+        <w:tab/>
+      </w:r>
+      <w:r>
+        <w:t xml:space="preserve">Responsável por gravar e carregar o estado completo da aplicação — tabuleiro, jogador </w:t>
+      </w:r>
+      <w:proofErr w:type="spellStart"/>
+      <w:r>
+        <w:t>actual</w:t>
+      </w:r>
+      <w:proofErr w:type="spellEnd"/>
+      <w:r>
+        <w:t xml:space="preserve"> e configurações — num ficheiro local.</w:t>
+      </w:r>
+    </w:p>
+    <w:p/>
+    <w:p>
+      <w:pPr>
+        <w:rPr>
+          <w:sz w:val="32"/>
+          <w:szCs w:val="32"/>
+        </w:rPr>
+      </w:pPr>
+      <w:r>
+        <w:rPr>
+          <w:sz w:val="32"/>
+          <w:szCs w:val="32"/>
+        </w:rPr>
+        <w:t>Classe FILEMANAGER:</w:t>
+      </w:r>
+    </w:p>
+    <w:p>
+      <w:pPr>
+        <w:rPr>
+          <w:sz w:val="32"/>
+          <w:szCs w:val="32"/>
+        </w:rPr>
+      </w:pPr>
+    </w:p>
+    <w:p>
+      <w:r>
+        <w:rPr>
+          <w:sz w:val="32"/>
+          <w:szCs w:val="32"/>
+        </w:rPr>
+        <w:tab/>
+      </w:r>
+      <w:r>
+        <w:t>Abstrai toda a lógica de I/O. Suporta dois formatos: serialização Java binária (.ser) e JSON (.</w:t>
+      </w:r>
+      <w:proofErr w:type="spellStart"/>
+      <w:r>
+        <w:t>json</w:t>
+      </w:r>
+      <w:proofErr w:type="spellEnd"/>
+      <w:r>
+        <w:t xml:space="preserve">), configurável via </w:t>
+      </w:r>
+      <w:proofErr w:type="spellStart"/>
+      <w:r>
+        <w:t>FormatoFicheiro</w:t>
+      </w:r>
+      <w:proofErr w:type="spellEnd"/>
+      <w:r>
+        <w:t>.</w:t>
+      </w:r>
+    </w:p>
+    <w:p/>
+    <w:p>
+      <w:r>
+        <w:rPr>
+          <w:noProof/>
+        </w:rPr>
+        <w:drawing>
+          <wp:inline distT="0" distB="0" distL="0" distR="0" wp14:anchorId="636F7883" wp14:editId="3B902A4E">
+            <wp:extent cx="5731510" cy="2225675"/>
+            <wp:effectExtent l="0" t="0" r="2540" b="3175"/>
+            <wp:docPr id="1024609418" name="Imagem 1"/>
+            <wp:cNvGraphicFramePr>
+              <a:graphicFrameLocks xmlns:a="http://schemas.openxmlformats.org/drawingml/2006/main" noChangeAspect="1"/>
+            </wp:cNvGraphicFramePr>
+            <a:graphic xmlns:a="http://schemas.openxmlformats.org/drawingml/2006/main">
+              <a:graphicData uri="http://schemas.openxmlformats.org/drawingml/2006/picture">
+                <pic:pic xmlns:pic="http://schemas.openxmlformats.org/drawingml/2006/picture">
+                  <pic:nvPicPr>
+                    <pic:cNvPr id="1024609418" name=""/>
+                    <pic:cNvPicPr/>
+                  </pic:nvPicPr>
+                  <pic:blipFill>
+                    <a:blip r:embed="rId21"/>
+                    <a:stretch>
+                      <a:fillRect/>
+                    </a:stretch>
+                  </pic:blipFill>
+                  <pic:spPr>
+                    <a:xfrm>
+                      <a:off x="0" y="0"/>
+                      <a:ext cx="5731510" cy="2225675"/>
+                    </a:xfrm>
+                    <a:prstGeom prst="rect">
+                      <a:avLst/>
+                    </a:prstGeom>
+                  </pic:spPr>
+                </pic:pic>
+              </a:graphicData>
+            </a:graphic>
+          </wp:inline>
+        </w:drawing>
+      </w:r>
+    </w:p>
+    <w:p/>
+    <w:p>
+      <w:pPr>
+        <w:rPr>
+          <w:sz w:val="32"/>
+          <w:szCs w:val="32"/>
+        </w:rPr>
+      </w:pPr>
+      <w:proofErr w:type="spellStart"/>
+      <w:r>
+        <w:rPr>
+          <w:sz w:val="32"/>
+          <w:szCs w:val="32"/>
+        </w:rPr>
+        <w:t>Enum</w:t>
+      </w:r>
+      <w:proofErr w:type="spellEnd"/>
+      <w:r>
+        <w:rPr>
+          <w:sz w:val="32"/>
+          <w:szCs w:val="32"/>
+        </w:rPr>
+        <w:t xml:space="preserve"> FORMATOFICHEIRO:</w:t>
+      </w:r>
+    </w:p>
+    <w:p>
+      <w:pPr>
+        <w:rPr>
+          <w:sz w:val="32"/>
+          <w:szCs w:val="32"/>
+        </w:rPr>
+      </w:pPr>
+    </w:p>
+    <w:p>
+      <w:pPr>
+        <w:rPr>
+          <w:sz w:val="32"/>
+          <w:szCs w:val="32"/>
+        </w:rPr>
+      </w:pPr>
+      <w:r>
+        <w:rPr>
+          <w:noProof/>
+        </w:rPr>
+        <w:drawing>
+          <wp:inline distT="0" distB="0" distL="0" distR="0" wp14:anchorId="7608B1A6" wp14:editId="5CBC180F">
+            <wp:extent cx="5731510" cy="822960"/>
+            <wp:effectExtent l="0" t="0" r="2540" b="0"/>
+            <wp:docPr id="2004565316" name="Imagem 1"/>
+            <wp:cNvGraphicFramePr>
+              <a:graphicFrameLocks xmlns:a="http://schemas.openxmlformats.org/drawingml/2006/main" noChangeAspect="1"/>
+            </wp:cNvGraphicFramePr>
+            <a:graphic xmlns:a="http://schemas.openxmlformats.org/drawingml/2006/main">
+              <a:graphicData uri="http://schemas.openxmlformats.org/drawingml/2006/picture">
+                <pic:pic xmlns:pic="http://schemas.openxmlformats.org/drawingml/2006/picture">
+                  <pic:nvPicPr>
+                    <pic:cNvPr id="2004565316" name=""/>
+                    <pic:cNvPicPr/>
+                  </pic:nvPicPr>
+                  <pic:blipFill>
+                    <a:blip r:embed="rId22"/>
+                    <a:stretch>
+                      <a:fillRect/>
+                    </a:stretch>
+                  </pic:blipFill>
+                  <pic:spPr>
+                    <a:xfrm>
+                      <a:off x="0" y="0"/>
+                      <a:ext cx="5731510" cy="822960"/>
+                    </a:xfrm>
+                    <a:prstGeom prst="rect">
+                      <a:avLst/>
+                    </a:prstGeom>
+                  </pic:spPr>
+                </pic:pic>
+              </a:graphicData>
+            </a:graphic>
+          </wp:inline>
+        </w:drawing>
+      </w:r>
+    </w:p>
+    <w:p/>
+    <w:p/>
     <w:p>
       <w:pPr>
         <w:rPr>

</xml_diff>

<commit_message>
Diagramas UML - diagrama de pacotes
</commit_message>
<xml_diff>
--- a/Estruturação da Aplicação.docx
+++ b/Estruturação da Aplicação.docx
@@ -1959,6 +1959,110 @@
       </w:r>
     </w:p>
     <w:p/>
+    <w:p/>
+    <w:p/>
+    <w:p>
+      <w:pPr>
+        <w:rPr>
+          <w:sz w:val="36"/>
+          <w:szCs w:val="36"/>
+        </w:rPr>
+      </w:pPr>
+      <w:r>
+        <w:rPr>
+          <w:sz w:val="36"/>
+          <w:szCs w:val="36"/>
+        </w:rPr>
+        <w:lastRenderedPageBreak/>
+        <w:t>Diagramas UML:</w:t>
+      </w:r>
+    </w:p>
+    <w:p>
+      <w:pPr>
+        <w:rPr>
+          <w:sz w:val="36"/>
+          <w:szCs w:val="36"/>
+        </w:rPr>
+      </w:pPr>
+    </w:p>
+    <w:p>
+      <w:pPr>
+        <w:rPr>
+          <w:sz w:val="32"/>
+          <w:szCs w:val="32"/>
+        </w:rPr>
+      </w:pPr>
+      <w:r>
+        <w:rPr>
+          <w:sz w:val="32"/>
+          <w:szCs w:val="32"/>
+        </w:rPr>
+        <w:t>Diagrama de Pacotes:</w:t>
+      </w:r>
+    </w:p>
+    <w:p>
+      <w:pPr>
+        <w:rPr>
+          <w:sz w:val="32"/>
+          <w:szCs w:val="32"/>
+        </w:rPr>
+      </w:pPr>
+    </w:p>
+    <w:p>
+      <w:r>
+        <w:rPr>
+          <w:sz w:val="32"/>
+          <w:szCs w:val="32"/>
+        </w:rPr>
+        <w:tab/>
+      </w:r>
+      <w:r>
+        <w:t>Visão de alto nível dos cinco pacotes e as suas dependências. As setas a tracejado representam dependências de uso (um pacote usa classes de outro).</w:t>
+      </w:r>
+    </w:p>
+    <w:p/>
+    <w:p>
+      <w:r>
+        <w:rPr>
+          <w:noProof/>
+        </w:rPr>
+        <w:drawing>
+          <wp:inline distT="0" distB="0" distL="0" distR="0" wp14:anchorId="6287B2A3" wp14:editId="2054F306">
+            <wp:extent cx="5731510" cy="3918585"/>
+            <wp:effectExtent l="0" t="0" r="2540" b="5715"/>
+            <wp:docPr id="1687041432" name="Imagem 1"/>
+            <wp:cNvGraphicFramePr>
+              <a:graphicFrameLocks xmlns:a="http://schemas.openxmlformats.org/drawingml/2006/main" noChangeAspect="1"/>
+            </wp:cNvGraphicFramePr>
+            <a:graphic xmlns:a="http://schemas.openxmlformats.org/drawingml/2006/main">
+              <a:graphicData uri="http://schemas.openxmlformats.org/drawingml/2006/picture">
+                <pic:pic xmlns:pic="http://schemas.openxmlformats.org/drawingml/2006/picture">
+                  <pic:nvPicPr>
+                    <pic:cNvPr id="1687041432" name=""/>
+                    <pic:cNvPicPr/>
+                  </pic:nvPicPr>
+                  <pic:blipFill>
+                    <a:blip r:embed="rId23"/>
+                    <a:stretch>
+                      <a:fillRect/>
+                    </a:stretch>
+                  </pic:blipFill>
+                  <pic:spPr>
+                    <a:xfrm>
+                      <a:off x="0" y="0"/>
+                      <a:ext cx="5731510" cy="3918585"/>
+                    </a:xfrm>
+                    <a:prstGeom prst="rect">
+                      <a:avLst/>
+                    </a:prstGeom>
+                  </pic:spPr>
+                </pic:pic>
+              </a:graphicData>
+            </a:graphic>
+          </wp:inline>
+        </w:drawing>
+      </w:r>
+    </w:p>
     <w:p/>
     <w:p>
       <w:pPr>

</xml_diff>

<commit_message>
Diagramas UML - diagrama de classes completo
</commit_message>
<xml_diff>
--- a/Estruturação da Aplicação.docx
+++ b/Estruturação da Aplicação.docx
@@ -2051,6 +2051,93 @@
                     <a:xfrm>
                       <a:off x="0" y="0"/>
                       <a:ext cx="5731510" cy="3918585"/>
+                    </a:xfrm>
+                    <a:prstGeom prst="rect">
+                      <a:avLst/>
+                    </a:prstGeom>
+                  </pic:spPr>
+                </pic:pic>
+              </a:graphicData>
+            </a:graphic>
+          </wp:inline>
+        </w:drawing>
+      </w:r>
+    </w:p>
+    <w:p/>
+    <w:p>
+      <w:pPr>
+        <w:rPr>
+          <w:sz w:val="32"/>
+          <w:szCs w:val="32"/>
+        </w:rPr>
+      </w:pPr>
+      <w:r>
+        <w:rPr>
+          <w:sz w:val="32"/>
+          <w:szCs w:val="32"/>
+        </w:rPr>
+        <w:t xml:space="preserve">Diagrama de </w:t>
+      </w:r>
+      <w:r>
+        <w:rPr>
+          <w:sz w:val="32"/>
+          <w:szCs w:val="32"/>
+        </w:rPr>
+        <w:t xml:space="preserve">Classes Completo: </w:t>
+      </w:r>
+    </w:p>
+    <w:p>
+      <w:pPr>
+        <w:rPr>
+          <w:sz w:val="32"/>
+          <w:szCs w:val="32"/>
+        </w:rPr>
+      </w:pPr>
+    </w:p>
+    <w:p>
+      <w:r>
+        <w:rPr>
+          <w:sz w:val="32"/>
+          <w:szCs w:val="32"/>
+        </w:rPr>
+        <w:tab/>
+      </w:r>
+      <w:r>
+        <w:t>O diagrama seguinte representa todas as classes, organizadas por pacote (strip colorida no topo de cada caixa), com atributos e métodos. As setas sólidas representam associações/composições; as tracejadas representam dependências.</w:t>
+      </w:r>
+    </w:p>
+    <w:p/>
+    <w:p>
+      <w:r>
+        <w:rPr>
+          <w:noProof/>
+        </w:rPr>
+        <w:lastRenderedPageBreak/>
+        <w:drawing>
+          <wp:inline distT="0" distB="0" distL="0" distR="0" wp14:anchorId="36564D07" wp14:editId="27D5E60D">
+            <wp:extent cx="5419725" cy="5495925"/>
+            <wp:effectExtent l="0" t="0" r="9525" b="9525"/>
+            <wp:docPr id="593273286" name="Imagem 1"/>
+            <wp:cNvGraphicFramePr>
+              <a:graphicFrameLocks xmlns:a="http://schemas.openxmlformats.org/drawingml/2006/main" noChangeAspect="1"/>
+            </wp:cNvGraphicFramePr>
+            <a:graphic xmlns:a="http://schemas.openxmlformats.org/drawingml/2006/main">
+              <a:graphicData uri="http://schemas.openxmlformats.org/drawingml/2006/picture">
+                <pic:pic xmlns:pic="http://schemas.openxmlformats.org/drawingml/2006/picture">
+                  <pic:nvPicPr>
+                    <pic:cNvPr id="593273286" name=""/>
+                    <pic:cNvPicPr/>
+                  </pic:nvPicPr>
+                  <pic:blipFill>
+                    <a:blip r:embed="rId24"/>
+                    <a:stretch>
+                      <a:fillRect/>
+                    </a:stretch>
+                  </pic:blipFill>
+                  <pic:spPr>
+                    <a:xfrm>
+                      <a:off x="0" y="0"/>
+                      <a:ext cx="5419725" cy="5495925"/>
                     </a:xfrm>
                     <a:prstGeom prst="rect">
                       <a:avLst/>

</xml_diff>

<commit_message>
Diagramas UML - diagrama de sequência
</commit_message>
<xml_diff>
--- a/Estruturação da Aplicação.docx
+++ b/Estruturação da Aplicação.docx
@@ -2150,6 +2150,120 @@
         </w:drawing>
       </w:r>
     </w:p>
+    <w:p/>
+    <w:p>
+      <w:pPr>
+        <w:rPr>
+          <w:sz w:val="32"/>
+          <w:szCs w:val="32"/>
+        </w:rPr>
+      </w:pPr>
+      <w:r>
+        <w:rPr>
+          <w:sz w:val="32"/>
+          <w:szCs w:val="32"/>
+        </w:rPr>
+        <w:t>Diagrama de sequência – Envio de jogada em rede:</w:t>
+      </w:r>
+    </w:p>
+    <w:p>
+      <w:pPr>
+        <w:rPr>
+          <w:sz w:val="32"/>
+          <w:szCs w:val="32"/>
+        </w:rPr>
+      </w:pPr>
+    </w:p>
+    <w:p>
+      <w:r>
+        <w:rPr>
+          <w:sz w:val="32"/>
+          <w:szCs w:val="32"/>
+        </w:rPr>
+        <w:tab/>
+      </w:r>
+      <w:r>
+        <w:t xml:space="preserve">Ilustra o fluxo de mensagens quando o Jogador 1 realiza uma jogada: o </w:t>
+      </w:r>
+      <w:proofErr w:type="spellStart"/>
+      <w:r>
+        <w:t>GameClient</w:t>
+      </w:r>
+      <w:proofErr w:type="spellEnd"/>
+      <w:r>
+        <w:t xml:space="preserve"> local envia a Jogada ao </w:t>
+      </w:r>
+      <w:proofErr w:type="spellStart"/>
+      <w:r>
+        <w:t>GameServer</w:t>
+      </w:r>
+      <w:proofErr w:type="spellEnd"/>
+      <w:r>
+        <w:t xml:space="preserve">, que valida, </w:t>
+      </w:r>
+      <w:proofErr w:type="spellStart"/>
+      <w:r>
+        <w:t>actualiza</w:t>
+      </w:r>
+      <w:proofErr w:type="spellEnd"/>
+      <w:r>
+        <w:t xml:space="preserve"> o </w:t>
+      </w:r>
+      <w:proofErr w:type="spellStart"/>
+      <w:r>
+        <w:t>GameState</w:t>
+      </w:r>
+      <w:proofErr w:type="spellEnd"/>
+      <w:r>
+        <w:t xml:space="preserve"> e difunde o novo estado a ambos os clientes.</w:t>
+      </w:r>
+    </w:p>
+    <w:p/>
+    <w:p>
+      <w:r>
+        <w:rPr>
+          <w:noProof/>
+        </w:rPr>
+        <w:lastRenderedPageBreak/>
+        <w:drawing>
+          <wp:inline distT="0" distB="0" distL="0" distR="0" wp14:anchorId="77D66911" wp14:editId="7789A383">
+            <wp:extent cx="5438775" cy="3114675"/>
+            <wp:effectExtent l="0" t="0" r="9525" b="9525"/>
+            <wp:docPr id="433239088" name="Imagem 1"/>
+            <wp:cNvGraphicFramePr>
+              <a:graphicFrameLocks xmlns:a="http://schemas.openxmlformats.org/drawingml/2006/main" noChangeAspect="1"/>
+            </wp:cNvGraphicFramePr>
+            <a:graphic xmlns:a="http://schemas.openxmlformats.org/drawingml/2006/main">
+              <a:graphicData uri="http://schemas.openxmlformats.org/drawingml/2006/picture">
+                <pic:pic xmlns:pic="http://schemas.openxmlformats.org/drawingml/2006/picture">
+                  <pic:nvPicPr>
+                    <pic:cNvPr id="433239088" name=""/>
+                    <pic:cNvPicPr/>
+                  </pic:nvPicPr>
+                  <pic:blipFill>
+                    <a:blip r:embed="rId25"/>
+                    <a:stretch>
+                      <a:fillRect/>
+                    </a:stretch>
+                  </pic:blipFill>
+                  <pic:spPr>
+                    <a:xfrm>
+                      <a:off x="0" y="0"/>
+                      <a:ext cx="5438775" cy="3114675"/>
+                    </a:xfrm>
+                    <a:prstGeom prst="rect">
+                      <a:avLst/>
+                    </a:prstGeom>
+                  </pic:spPr>
+                </pic:pic>
+              </a:graphicData>
+            </a:graphic>
+          </wp:inline>
+        </w:drawing>
+      </w:r>
+    </w:p>
+    <w:p/>
+    <w:p/>
     <w:p/>
     <w:p>
       <w:pPr>

</xml_diff>

<commit_message>
Criar PowerPoint de estruturação
</commit_message>
<xml_diff>
--- a/Estruturação da Aplicação.docx
+++ b/Estruturação da Aplicação.docx
@@ -2264,6 +2264,142 @@
     </w:p>
     <w:p/>
     <w:p/>
+    <w:p/>
+    <w:p/>
+    <w:p/>
+    <w:p/>
+    <w:p/>
+    <w:p/>
+    <w:p/>
+    <w:p/>
+    <w:p/>
+    <w:p/>
+    <w:p/>
+    <w:p/>
+    <w:p/>
+    <w:p/>
+    <w:p/>
+    <w:p/>
+    <w:p>
+      <w:pPr>
+        <w:rPr>
+          <w:sz w:val="32"/>
+          <w:szCs w:val="32"/>
+        </w:rPr>
+      </w:pPr>
+      <w:r>
+        <w:rPr>
+          <w:sz w:val="32"/>
+          <w:szCs w:val="32"/>
+        </w:rPr>
+        <w:lastRenderedPageBreak/>
+        <w:t>Relações entre classes:</w:t>
+      </w:r>
+    </w:p>
+    <w:p>
+      <w:pPr>
+        <w:rPr>
+          <w:sz w:val="32"/>
+          <w:szCs w:val="32"/>
+        </w:rPr>
+      </w:pPr>
+    </w:p>
+    <w:p>
+      <w:pPr>
+        <w:rPr>
+          <w:sz w:val="32"/>
+          <w:szCs w:val="32"/>
+        </w:rPr>
+      </w:pPr>
+      <w:r>
+        <w:rPr>
+          <w:noProof/>
+        </w:rPr>
+        <w:drawing>
+          <wp:inline distT="0" distB="0" distL="0" distR="0" wp14:anchorId="440C7025" wp14:editId="2C372577">
+            <wp:extent cx="5438775" cy="3238500"/>
+            <wp:effectExtent l="0" t="0" r="9525" b="0"/>
+            <wp:docPr id="362212678" name="Imagem 1"/>
+            <wp:cNvGraphicFramePr>
+              <a:graphicFrameLocks xmlns:a="http://schemas.openxmlformats.org/drawingml/2006/main" noChangeAspect="1"/>
+            </wp:cNvGraphicFramePr>
+            <a:graphic xmlns:a="http://schemas.openxmlformats.org/drawingml/2006/main">
+              <a:graphicData uri="http://schemas.openxmlformats.org/drawingml/2006/picture">
+                <pic:pic xmlns:pic="http://schemas.openxmlformats.org/drawingml/2006/picture">
+                  <pic:nvPicPr>
+                    <pic:cNvPr id="362212678" name=""/>
+                    <pic:cNvPicPr/>
+                  </pic:nvPicPr>
+                  <pic:blipFill>
+                    <a:blip r:embed="rId26"/>
+                    <a:stretch>
+                      <a:fillRect/>
+                    </a:stretch>
+                  </pic:blipFill>
+                  <pic:spPr>
+                    <a:xfrm>
+                      <a:off x="0" y="0"/>
+                      <a:ext cx="5438775" cy="3238500"/>
+                    </a:xfrm>
+                    <a:prstGeom prst="rect">
+                      <a:avLst/>
+                    </a:prstGeom>
+                  </pic:spPr>
+                </pic:pic>
+              </a:graphicData>
+            </a:graphic>
+          </wp:inline>
+        </w:drawing>
+      </w:r>
+    </w:p>
+    <w:p>
+      <w:pPr>
+        <w:rPr>
+          <w:sz w:val="32"/>
+          <w:szCs w:val="32"/>
+        </w:rPr>
+      </w:pPr>
+      <w:r>
+        <w:rPr>
+          <w:noProof/>
+        </w:rPr>
+        <w:drawing>
+          <wp:inline distT="0" distB="0" distL="0" distR="0" wp14:anchorId="08A8B869" wp14:editId="4BB73DA8">
+            <wp:extent cx="5419725" cy="733425"/>
+            <wp:effectExtent l="0" t="0" r="9525" b="9525"/>
+            <wp:docPr id="1297706394" name="Imagem 1"/>
+            <wp:cNvGraphicFramePr>
+              <a:graphicFrameLocks xmlns:a="http://schemas.openxmlformats.org/drawingml/2006/main" noChangeAspect="1"/>
+            </wp:cNvGraphicFramePr>
+            <a:graphic xmlns:a="http://schemas.openxmlformats.org/drawingml/2006/main">
+              <a:graphicData uri="http://schemas.openxmlformats.org/drawingml/2006/picture">
+                <pic:pic xmlns:pic="http://schemas.openxmlformats.org/drawingml/2006/picture">
+                  <pic:nvPicPr>
+                    <pic:cNvPr id="1297706394" name=""/>
+                    <pic:cNvPicPr/>
+                  </pic:nvPicPr>
+                  <pic:blipFill>
+                    <a:blip r:embed="rId27"/>
+                    <a:stretch>
+                      <a:fillRect/>
+                    </a:stretch>
+                  </pic:blipFill>
+                  <pic:spPr>
+                    <a:xfrm>
+                      <a:off x="0" y="0"/>
+                      <a:ext cx="5419725" cy="733425"/>
+                    </a:xfrm>
+                    <a:prstGeom prst="rect">
+                      <a:avLst/>
+                    </a:prstGeom>
+                  </pic:spPr>
+                </pic:pic>
+              </a:graphicData>
+            </a:graphic>
+          </wp:inline>
+        </w:drawing>
+      </w:r>
+    </w:p>
     <w:p/>
     <w:p>
       <w:pPr>

</xml_diff>